<commit_message>
Reduce repeated code with dictionaries
</commit_message>
<xml_diff>
--- a/ASLWrite_Ext_Guide_20240724.docx
+++ b/ASLWrite_Ext_Guide_20240724.docx
@@ -1592,7 +1592,15 @@
         <w:t>The Symbol can be a Handshape, Diacritic, Movement Mark, Body Position</w:t>
       </w:r>
       <w:r>
-        <w:t>, or Extramanual Mark</w:t>
+        <w:t xml:space="preserve">, or </w:t>
+      </w:r>
+      <w:proofErr w:type="spellStart"/>
+      <w:r>
+        <w:t>Extramanual</w:t>
+      </w:r>
+      <w:proofErr w:type="spellEnd"/>
+      <w:r>
+        <w:t xml:space="preserve"> Mark</w:t>
       </w:r>
       <w:r>
         <w:t xml:space="preserve">.   </w:t>
@@ -1799,6 +1807,7 @@
               <w:rPr>
                 <w:b/>
                 <w:bCs/>
+                <w:noProof/>
               </w:rPr>
               <w:drawing>
                 <wp:inline distT="0" distB="0" distL="0" distR="0" wp14:anchorId="25A12B66" wp14:editId="1D6C37B6">
@@ -3564,6 +3573,7 @@
                 <w:bCs/>
               </w:rPr>
             </w:pPr>
+            <w:proofErr w:type="spellStart"/>
             <w:r>
               <w:rPr>
                 <w:b/>
@@ -3571,6 +3581,7 @@
               </w:rPr>
               <w:t>i</w:t>
             </w:r>
+            <w:proofErr w:type="spellEnd"/>
           </w:p>
         </w:tc>
       </w:tr>
@@ -4044,6 +4055,7 @@
               <w:rPr>
                 <w:b/>
                 <w:bCs/>
+                <w:noProof/>
                 <w:color w:val="FF0000"/>
               </w:rPr>
               <w:drawing>
@@ -5198,6 +5210,7 @@
               <w:rPr>
                 <w:b/>
                 <w:bCs/>
+                <w:noProof/>
               </w:rPr>
               <w:drawing>
                 <wp:inline distT="0" distB="0" distL="0" distR="0" wp14:anchorId="032B7C1B" wp14:editId="4E9915A4">
@@ -5581,6 +5594,7 @@
               <w:rPr>
                 <w:b/>
                 <w:bCs/>
+                <w:noProof/>
                 <w:color w:val="FF0000"/>
               </w:rPr>
               <w:drawing>
@@ -5658,6 +5672,7 @@
               <w:rPr>
                 <w:b/>
                 <w:bCs/>
+                <w:noProof/>
               </w:rPr>
               <w:drawing>
                 <wp:inline distT="0" distB="0" distL="0" distR="0" wp14:anchorId="0BCD58B0" wp14:editId="335F5183">
@@ -5732,6 +5747,7 @@
               <w:rPr>
                 <w:b/>
                 <w:bCs/>
+                <w:noProof/>
               </w:rPr>
               <w:drawing>
                 <wp:inline distT="0" distB="0" distL="0" distR="0" wp14:anchorId="23B1AD6F" wp14:editId="4D40CB89">
@@ -5806,6 +5822,7 @@
               <w:rPr>
                 <w:b/>
                 <w:bCs/>
+                <w:noProof/>
               </w:rPr>
               <w:drawing>
                 <wp:inline distT="0" distB="0" distL="0" distR="0" wp14:anchorId="0002792A" wp14:editId="79EEF8E7">
@@ -5880,6 +5897,7 @@
               <w:rPr>
                 <w:b/>
                 <w:bCs/>
+                <w:noProof/>
               </w:rPr>
               <w:drawing>
                 <wp:inline distT="0" distB="0" distL="0" distR="0" wp14:anchorId="2529F77C" wp14:editId="5608095E">
@@ -6028,6 +6046,7 @@
               <w:rPr>
                 <w:b/>
                 <w:bCs/>
+                <w:noProof/>
                 <w:color w:val="FF0000"/>
               </w:rPr>
               <w:drawing>
@@ -6706,8 +6725,13 @@
         <w:pStyle w:val="Heading1"/>
       </w:pPr>
       <w:bookmarkStart w:id="6" w:name="_Toc173219973"/>
-      <w:r>
-        <w:t>Extramanual Marks</w:t>
+      <w:proofErr w:type="spellStart"/>
+      <w:r>
+        <w:t>Extramanual</w:t>
+      </w:r>
+      <w:proofErr w:type="spellEnd"/>
+      <w:r>
+        <w:t xml:space="preserve"> Marks</w:t>
       </w:r>
       <w:bookmarkEnd w:id="6"/>
     </w:p>
@@ -10382,7 +10406,16 @@
       </w:r>
       <w:bookmarkEnd w:id="20"/>
     </w:p>
-    <w:p/>
+    <w:p>
+      <w:r>
+        <w:t xml:space="preserve">This is not an “official” </w:t>
+      </w:r>
+      <w:proofErr w:type="gramStart"/>
+      <w:r>
+        <w:t>dictionary</w:t>
+      </w:r>
+      <w:proofErr w:type="gramEnd"/>
+    </w:p>
     <w:tbl>
       <w:tblPr>
         <w:tblW w:w="8450" w:type="dxa"/>
@@ -11677,15 +11710,6 @@
                 <w14:ligatures w14:val="none"/>
               </w:rPr>
             </w:pPr>
-            <w:r>
-              <w:rPr>
-                <w:rFonts w:ascii="Calibri" w:eastAsia="Times New Roman" w:hAnsi="Calibri" w:cs="Calibri"/>
-                <w:color w:val="000000"/>
-                <w:kern w:val="0"/>
-                <w14:ligatures w14:val="none"/>
-              </w:rPr>
-              <w:t>17</w:t>
-            </w:r>
             <w:proofErr w:type="gramStart"/>
             <w:r>
               <w:rPr>
@@ -11694,16 +11718,7 @@
                 <w:kern w:val="0"/>
                 <w14:ligatures w14:val="none"/>
               </w:rPr>
-              <w:t>-!</w:t>
-            </w:r>
-            <w:r>
-              <w:rPr>
-                <w:rFonts w:ascii="Calibri" w:eastAsia="Times New Roman" w:hAnsi="Calibri" w:cs="Calibri"/>
-                <w:color w:val="000000"/>
-                <w:kern w:val="0"/>
-                <w14:ligatures w14:val="none"/>
-              </w:rPr>
-              <w:t>t</w:t>
+              <w:t>!u</w:t>
             </w:r>
             <w:proofErr w:type="gramEnd"/>
             <w:r>
@@ -11713,25 +11728,7 @@
                 <w:kern w:val="0"/>
                 <w14:ligatures w14:val="none"/>
               </w:rPr>
-              <w:t>/6'-11-1/7-!</w:t>
-            </w:r>
-            <w:r>
-              <w:rPr>
-                <w:rFonts w:ascii="Calibri" w:eastAsia="Times New Roman" w:hAnsi="Calibri" w:cs="Calibri"/>
-                <w:color w:val="000000"/>
-                <w:kern w:val="0"/>
-                <w14:ligatures w14:val="none"/>
-              </w:rPr>
-              <w:t>t</w:t>
-            </w:r>
-            <w:r>
-              <w:rPr>
-                <w:rFonts w:ascii="Calibri" w:eastAsia="Times New Roman" w:hAnsi="Calibri" w:cs="Calibri"/>
-                <w:color w:val="000000"/>
-                <w:kern w:val="0"/>
-                <w14:ligatures w14:val="none"/>
-              </w:rPr>
-              <w:t>2'-1/1</w:t>
+              <w:t>/6'|11-1/7|!u2'</w:t>
             </w:r>
           </w:p>
         </w:tc>
@@ -12132,7 +12129,7 @@
           <w:tcPr>
             <w:tcW w:w="2600" w:type="dxa"/>
             <w:tcBorders>
-              <w:top w:val="nil"/>
+              <w:top w:val="single" w:sz="8" w:space="0" w:color="auto"/>
               <w:left w:val="single" w:sz="8" w:space="0" w:color="auto"/>
               <w:bottom w:val="single" w:sz="8" w:space="0" w:color="auto"/>
               <w:right w:val="single" w:sz="8" w:space="0" w:color="auto"/>
@@ -12140,7 +12137,6 @@
             <w:shd w:val="clear" w:color="auto" w:fill="auto"/>
             <w:noWrap/>
             <w:vAlign w:val="center"/>
-            <w:hideMark/>
           </w:tcPr>
           <w:p>
             <w:pPr>
@@ -12159,7 +12155,7 @@
                 <w:kern w:val="0"/>
                 <w14:ligatures w14:val="none"/>
               </w:rPr>
-              <w:t xml:space="preserve">CONTINUE </w:t>
+              <w:t>COME</w:t>
             </w:r>
           </w:p>
         </w:tc>
@@ -12167,14 +12163,13 @@
           <w:tcPr>
             <w:tcW w:w="5850" w:type="dxa"/>
             <w:tcBorders>
-              <w:top w:val="nil"/>
+              <w:top w:val="single" w:sz="8" w:space="0" w:color="auto"/>
               <w:left w:val="nil"/>
               <w:bottom w:val="single" w:sz="8" w:space="0" w:color="auto"/>
               <w:right w:val="single" w:sz="8" w:space="0" w:color="auto"/>
             </w:tcBorders>
             <w:shd w:val="clear" w:color="auto" w:fill="auto"/>
             <w:vAlign w:val="center"/>
-            <w:hideMark/>
           </w:tcPr>
           <w:p>
             <w:pPr>
@@ -12186,35 +12181,6 @@
                 <w14:ligatures w14:val="none"/>
               </w:rPr>
             </w:pPr>
-            <w:r>
-              <w:rPr>
-                <w:rFonts w:ascii="Calibri" w:eastAsia="Times New Roman" w:hAnsi="Calibri" w:cs="Calibri"/>
-                <w:color w:val="000000"/>
-                <w:kern w:val="0"/>
-                <w14:ligatures w14:val="none"/>
-              </w:rPr>
-              <w:t>A/</w:t>
-            </w:r>
-            <w:proofErr w:type="gramStart"/>
-            <w:r>
-              <w:rPr>
-                <w:rFonts w:ascii="Calibri" w:eastAsia="Times New Roman" w:hAnsi="Calibri" w:cs="Calibri"/>
-                <w:color w:val="000000"/>
-                <w:kern w:val="0"/>
-                <w14:ligatures w14:val="none"/>
-              </w:rPr>
-              <w:t>=!z</w:t>
-            </w:r>
-            <w:proofErr w:type="gramEnd"/>
-            <w:r>
-              <w:rPr>
-                <w:rFonts w:ascii="Calibri" w:eastAsia="Times New Roman" w:hAnsi="Calibri" w:cs="Calibri"/>
-                <w:color w:val="000000"/>
-                <w:kern w:val="0"/>
-                <w14:ligatures w14:val="none"/>
-              </w:rPr>
-              <w:t>;-A</w:t>
-            </w:r>
           </w:p>
         </w:tc>
       </w:tr>
@@ -12234,6 +12200,7 @@
             <w:shd w:val="clear" w:color="auto" w:fill="auto"/>
             <w:noWrap/>
             <w:vAlign w:val="center"/>
+            <w:hideMark/>
           </w:tcPr>
           <w:p>
             <w:pPr>
@@ -12252,7 +12219,7 @@
                 <w:kern w:val="0"/>
                 <w14:ligatures w14:val="none"/>
               </w:rPr>
-              <w:t>CONTRACT/CONCLUDE</w:t>
+              <w:t xml:space="preserve">CONTINUE </w:t>
             </w:r>
           </w:p>
         </w:tc>
@@ -12267,6 +12234,7 @@
             </w:tcBorders>
             <w:shd w:val="clear" w:color="auto" w:fill="auto"/>
             <w:vAlign w:val="center"/>
+            <w:hideMark/>
           </w:tcPr>
           <w:p>
             <w:pPr>
@@ -12278,6 +12246,15 @@
                 <w14:ligatures w14:val="none"/>
               </w:rPr>
             </w:pPr>
+            <w:r>
+              <w:rPr>
+                <w:rFonts w:ascii="Calibri" w:eastAsia="Times New Roman" w:hAnsi="Calibri" w:cs="Calibri"/>
+                <w:color w:val="000000"/>
+                <w:kern w:val="0"/>
+                <w14:ligatures w14:val="none"/>
+              </w:rPr>
+              <w:t>A/</w:t>
+            </w:r>
             <w:proofErr w:type="gramStart"/>
             <w:r>
               <w:rPr>
@@ -12286,7 +12263,7 @@
                 <w:kern w:val="0"/>
                 <w14:ligatures w14:val="none"/>
               </w:rPr>
-              <w:t>!u</w:t>
+              <w:t>=!z</w:t>
             </w:r>
             <w:proofErr w:type="gramEnd"/>
             <w:r>
@@ -12296,7 +12273,7 @@
                 <w:kern w:val="0"/>
                 <w14:ligatures w14:val="none"/>
               </w:rPr>
-              <w:t>3-c'/=s/1=s7=c'|!u5/</w:t>
+              <w:t>;-A</w:t>
             </w:r>
           </w:p>
         </w:tc>
@@ -12335,7 +12312,7 @@
                 <w:kern w:val="0"/>
                 <w14:ligatures w14:val="none"/>
               </w:rPr>
-              <w:t>COUNTRY</w:t>
+              <w:t>CONTRACT/CONCLUDE</w:t>
             </w:r>
           </w:p>
         </w:tc>
@@ -12361,15 +12338,6 @@
                 <w14:ligatures w14:val="none"/>
               </w:rPr>
             </w:pPr>
-            <w:r>
-              <w:rPr>
-                <w:rFonts w:ascii="Calibri" w:eastAsia="Times New Roman" w:hAnsi="Calibri" w:cs="Calibri"/>
-                <w:color w:val="000000"/>
-                <w:kern w:val="0"/>
-                <w14:ligatures w14:val="none"/>
-              </w:rPr>
-              <w:t>s/1| @:2</w:t>
-            </w:r>
             <w:proofErr w:type="gramStart"/>
             <w:r>
               <w:rPr>
@@ -12378,7 +12346,7 @@
                 <w:kern w:val="0"/>
                 <w14:ligatures w14:val="none"/>
               </w:rPr>
-              <w:t>|[</w:t>
+              <w:t>!u</w:t>
             </w:r>
             <w:proofErr w:type="gramEnd"/>
             <w:r>
@@ -12388,7 +12356,7 @@
                 <w:kern w:val="0"/>
                 <w14:ligatures w14:val="none"/>
               </w:rPr>
-              <w:t>a;;|  5/6.</w:t>
+              <w:t>3-c'/=s/1=s7=c'|!u5/</w:t>
             </w:r>
           </w:p>
         </w:tc>
@@ -12409,7 +12377,6 @@
             <w:shd w:val="clear" w:color="auto" w:fill="auto"/>
             <w:noWrap/>
             <w:vAlign w:val="center"/>
-            <w:hideMark/>
           </w:tcPr>
           <w:p>
             <w:pPr>
@@ -12428,7 +12395,7 @@
                 <w:kern w:val="0"/>
                 <w14:ligatures w14:val="none"/>
               </w:rPr>
-              <w:t xml:space="preserve">DEAF </w:t>
+              <w:t>COUNTRY</w:t>
             </w:r>
           </w:p>
         </w:tc>
@@ -12443,7 +12410,6 @@
             </w:tcBorders>
             <w:shd w:val="clear" w:color="auto" w:fill="auto"/>
             <w:vAlign w:val="center"/>
-            <w:hideMark/>
           </w:tcPr>
           <w:p>
             <w:pPr>
@@ -12455,6 +12421,15 @@
                 <w14:ligatures w14:val="none"/>
               </w:rPr>
             </w:pPr>
+            <w:r>
+              <w:rPr>
+                <w:rFonts w:ascii="Calibri" w:eastAsia="Times New Roman" w:hAnsi="Calibri" w:cs="Calibri"/>
+                <w:color w:val="000000"/>
+                <w:kern w:val="0"/>
+                <w14:ligatures w14:val="none"/>
+              </w:rPr>
+              <w:t>s/1| @:2</w:t>
+            </w:r>
             <w:proofErr w:type="gramStart"/>
             <w:r>
               <w:rPr>
@@ -12463,7 +12438,7 @@
                 <w:kern w:val="0"/>
                 <w14:ligatures w14:val="none"/>
               </w:rPr>
-              <w:t>1,-</w:t>
+              <w:t>|[</w:t>
             </w:r>
             <w:proofErr w:type="gramEnd"/>
             <w:r>
@@ -12473,7 +12448,7 @@
                 <w:kern w:val="0"/>
                 <w14:ligatures w14:val="none"/>
               </w:rPr>
-              <w:t>.; ..=}</w:t>
+              <w:t>a;;|  5/6.</w:t>
             </w:r>
           </w:p>
         </w:tc>
@@ -12513,7 +12488,7 @@
                 <w:kern w:val="0"/>
                 <w14:ligatures w14:val="none"/>
               </w:rPr>
-              <w:t xml:space="preserve">DIE </w:t>
+              <w:t xml:space="preserve">DEAF </w:t>
             </w:r>
           </w:p>
         </w:tc>
@@ -12540,15 +12515,6 @@
                 <w14:ligatures w14:val="none"/>
               </w:rPr>
             </w:pPr>
-            <w:r>
-              <w:rPr>
-                <w:rFonts w:ascii="Calibri" w:eastAsia="Times New Roman" w:hAnsi="Calibri" w:cs="Calibri"/>
-                <w:color w:val="000000"/>
-                <w:kern w:val="0"/>
-                <w14:ligatures w14:val="none"/>
-              </w:rPr>
-              <w:t>B'|!</w:t>
-            </w:r>
             <w:proofErr w:type="gramStart"/>
             <w:r>
               <w:rPr>
@@ -12557,7 +12523,7 @@
                 <w:kern w:val="0"/>
                 <w14:ligatures w14:val="none"/>
               </w:rPr>
-              <w:t>2,|</w:t>
+              <w:t>1,-</w:t>
             </w:r>
             <w:proofErr w:type="gramEnd"/>
             <w:r>
@@ -12567,7 +12533,7 @@
                 <w:kern w:val="0"/>
                 <w14:ligatures w14:val="none"/>
               </w:rPr>
-              <w:t xml:space="preserve"> @o. B'|!2,| @o.</w:t>
+              <w:t>.; ..=}</w:t>
             </w:r>
           </w:p>
         </w:tc>
@@ -12588,6 +12554,7 @@
             <w:shd w:val="clear" w:color="auto" w:fill="auto"/>
             <w:noWrap/>
             <w:vAlign w:val="center"/>
+            <w:hideMark/>
           </w:tcPr>
           <w:p>
             <w:pPr>
@@ -12606,7 +12573,7 @@
                 <w:kern w:val="0"/>
                 <w14:ligatures w14:val="none"/>
               </w:rPr>
-              <w:t>EXPAND/VISUALIZE</w:t>
+              <w:t xml:space="preserve">DIE </w:t>
             </w:r>
           </w:p>
         </w:tc>
@@ -12621,6 +12588,7 @@
             </w:tcBorders>
             <w:shd w:val="clear" w:color="auto" w:fill="auto"/>
             <w:vAlign w:val="center"/>
+            <w:hideMark/>
           </w:tcPr>
           <w:p>
             <w:pPr>
@@ -12632,6 +12600,15 @@
                 <w14:ligatures w14:val="none"/>
               </w:rPr>
             </w:pPr>
+            <w:r>
+              <w:rPr>
+                <w:rFonts w:ascii="Calibri" w:eastAsia="Times New Roman" w:hAnsi="Calibri" w:cs="Calibri"/>
+                <w:color w:val="000000"/>
+                <w:kern w:val="0"/>
+                <w14:ligatures w14:val="none"/>
+              </w:rPr>
+              <w:t>B'|!</w:t>
+            </w:r>
             <w:proofErr w:type="gramStart"/>
             <w:r>
               <w:rPr>
@@ -12640,7 +12617,7 @@
                 <w:kern w:val="0"/>
                 <w14:ligatures w14:val="none"/>
               </w:rPr>
-              <w:t>!u</w:t>
+              <w:t>2,|</w:t>
             </w:r>
             <w:proofErr w:type="gramEnd"/>
             <w:r>
@@ -12650,7 +12627,7 @@
                 <w:kern w:val="0"/>
                 <w14:ligatures w14:val="none"/>
               </w:rPr>
-              <w:t>/7-c'/=s/1=s7=c'|!u1</w:t>
+              <w:t xml:space="preserve"> @o. B'|!2,| @o.</w:t>
             </w:r>
           </w:p>
         </w:tc>
@@ -12671,7 +12648,6 @@
             <w:shd w:val="clear" w:color="auto" w:fill="auto"/>
             <w:noWrap/>
             <w:vAlign w:val="center"/>
-            <w:hideMark/>
           </w:tcPr>
           <w:p>
             <w:pPr>
@@ -12690,7 +12666,16 @@
                 <w:kern w:val="0"/>
                 <w14:ligatures w14:val="none"/>
               </w:rPr>
-              <w:t>FAMILY</w:t>
+              <w:t>DRINK</w:t>
+            </w:r>
+            <w:r>
+              <w:rPr>
+                <w:rFonts w:ascii="Calibri" w:eastAsia="Times New Roman" w:hAnsi="Calibri" w:cs="Calibri"/>
+                <w:color w:val="000000"/>
+                <w:kern w:val="0"/>
+                <w14:ligatures w14:val="none"/>
+              </w:rPr>
+              <w:t xml:space="preserve"> (noun)</w:t>
             </w:r>
           </w:p>
         </w:tc>
@@ -12705,7 +12690,6 @@
             </w:tcBorders>
             <w:shd w:val="clear" w:color="auto" w:fill="auto"/>
             <w:vAlign w:val="center"/>
-            <w:hideMark/>
           </w:tcPr>
           <w:p>
             <w:pPr>
@@ -12725,7 +12709,7 @@
                 <w:kern w:val="0"/>
                 <w14:ligatures w14:val="none"/>
               </w:rPr>
-              <w:t>!c</w:t>
+              <w:t>}~</w:t>
             </w:r>
             <w:proofErr w:type="gramEnd"/>
             <w:r>
@@ -12735,43 +12719,7 @@
                 <w:kern w:val="0"/>
                 <w14:ligatures w14:val="none"/>
               </w:rPr>
-              <w:t>=5/.|</w:t>
-            </w:r>
-            <w:r>
-              <w:rPr>
-                <w:rFonts w:ascii="Calibri" w:eastAsia="Times New Roman" w:hAnsi="Calibri" w:cs="Calibri"/>
-                <w:color w:val="000000"/>
-                <w:kern w:val="0"/>
-                <w14:ligatures w14:val="none"/>
-              </w:rPr>
-              <w:t>o</w:t>
-            </w:r>
-            <w:r>
-              <w:rPr>
-                <w:rFonts w:ascii="Calibri" w:eastAsia="Times New Roman" w:hAnsi="Calibri" w:cs="Calibri"/>
-                <w:color w:val="000000"/>
-                <w:kern w:val="0"/>
-                <w14:ligatures w14:val="none"/>
-              </w:rPr>
-              <w:t>/'=</w:t>
-            </w:r>
-            <w:r>
-              <w:rPr>
-                <w:rFonts w:ascii="Calibri" w:eastAsia="Times New Roman" w:hAnsi="Calibri" w:cs="Calibri"/>
-                <w:color w:val="000000"/>
-                <w:kern w:val="0"/>
-                <w14:ligatures w14:val="none"/>
-              </w:rPr>
-              <w:t>o</w:t>
-            </w:r>
-            <w:r>
-              <w:rPr>
-                <w:rFonts w:ascii="Calibri" w:eastAsia="Times New Roman" w:hAnsi="Calibri" w:cs="Calibri"/>
-                <w:color w:val="000000"/>
-                <w:kern w:val="0"/>
-                <w14:ligatures w14:val="none"/>
-              </w:rPr>
-              <w:t>'|5.=!c/</w:t>
+              <w:t>4;/=c.=@s.</w:t>
             </w:r>
           </w:p>
         </w:tc>
@@ -12810,7 +12758,7 @@
                 <w:kern w:val="0"/>
                 <w14:ligatures w14:val="none"/>
               </w:rPr>
-              <w:t>FOLLOW</w:t>
+              <w:t>DRINK (verb)</w:t>
             </w:r>
           </w:p>
         </w:tc>
@@ -12836,15 +12784,6 @@
                 <w14:ligatures w14:val="none"/>
               </w:rPr>
             </w:pPr>
-            <w:r>
-              <w:rPr>
-                <w:rFonts w:ascii="Calibri" w:eastAsia="Times New Roman" w:hAnsi="Calibri" w:cs="Calibri"/>
-                <w:color w:val="000000"/>
-                <w:kern w:val="0"/>
-                <w14:ligatures w14:val="none"/>
-              </w:rPr>
-              <w:t>}] !</w:t>
-            </w:r>
             <w:proofErr w:type="gramStart"/>
             <w:r>
               <w:rPr>
@@ -12853,7 +12792,7 @@
                 <w:kern w:val="0"/>
                 <w14:ligatures w14:val="none"/>
               </w:rPr>
-              <w:t>2,|</w:t>
+              <w:t>}~</w:t>
             </w:r>
             <w:proofErr w:type="gramEnd"/>
             <w:r>
@@ -12863,7 +12802,7 @@
                 <w:kern w:val="0"/>
                 <w14:ligatures w14:val="none"/>
               </w:rPr>
-              <w:t>A2; A2;</w:t>
+              <w:t>4;/=c.|!c/7</w:t>
             </w:r>
           </w:p>
         </w:tc>
@@ -12902,7 +12841,7 @@
                 <w:kern w:val="0"/>
                 <w14:ligatures w14:val="none"/>
               </w:rPr>
-              <w:t>FOOD</w:t>
+              <w:t>EMAIL</w:t>
             </w:r>
           </w:p>
         </w:tc>
@@ -12928,6 +12867,15 @@
                 <w14:ligatures w14:val="none"/>
               </w:rPr>
             </w:pPr>
+            <w:r>
+              <w:rPr>
+                <w:rFonts w:ascii="Calibri" w:eastAsia="Times New Roman" w:hAnsi="Calibri" w:cs="Calibri"/>
+                <w:color w:val="000000"/>
+                <w:kern w:val="0"/>
+                <w14:ligatures w14:val="none"/>
+              </w:rPr>
+              <w:t>c/</w:t>
+            </w:r>
             <w:proofErr w:type="gramStart"/>
             <w:r>
               <w:rPr>
@@ -12936,7 +12884,7 @@
                 <w:kern w:val="0"/>
                 <w14:ligatures w14:val="none"/>
               </w:rPr>
-              <w:t>:2..</w:t>
+              <w:t>-!c</w:t>
             </w:r>
             <w:proofErr w:type="gramEnd"/>
             <w:r>
@@ -12946,25 +12894,7 @@
                 <w:kern w:val="0"/>
                 <w14:ligatures w14:val="none"/>
               </w:rPr>
-              <w:t>| }=</w:t>
-            </w:r>
-            <w:r>
-              <w:rPr>
-                <w:rFonts w:ascii="Calibri" w:eastAsia="Times New Roman" w:hAnsi="Calibri" w:cs="Calibri"/>
-                <w:color w:val="000000"/>
-                <w:kern w:val="0"/>
-                <w14:ligatures w14:val="none"/>
-              </w:rPr>
-              <w:t>o</w:t>
-            </w:r>
-            <w:r>
-              <w:rPr>
-                <w:rFonts w:ascii="Calibri" w:eastAsia="Times New Roman" w:hAnsi="Calibri" w:cs="Calibri"/>
-                <w:color w:val="000000"/>
-                <w:kern w:val="0"/>
-                <w14:ligatures w14:val="none"/>
-              </w:rPr>
-              <w:t>,</w:t>
+              <w:t>=16</w:t>
             </w:r>
           </w:p>
         </w:tc>
@@ -12985,7 +12915,6 @@
             <w:shd w:val="clear" w:color="auto" w:fill="auto"/>
             <w:noWrap/>
             <w:vAlign w:val="center"/>
-            <w:hideMark/>
           </w:tcPr>
           <w:p>
             <w:pPr>
@@ -13004,7 +12933,7 @@
                 <w:kern w:val="0"/>
                 <w14:ligatures w14:val="none"/>
               </w:rPr>
-              <w:t xml:space="preserve">FIRST </w:t>
+              <w:t>EXCUSE/FORGIVE</w:t>
             </w:r>
           </w:p>
         </w:tc>
@@ -13019,7 +12948,6 @@
             </w:tcBorders>
             <w:shd w:val="clear" w:color="auto" w:fill="auto"/>
             <w:vAlign w:val="center"/>
-            <w:hideMark/>
           </w:tcPr>
           <w:p>
             <w:pPr>
@@ -13038,7 +12966,27 @@
                 <w:kern w:val="0"/>
                 <w14:ligatures w14:val="none"/>
               </w:rPr>
-              <w:t>1;|@o.</w:t>
+              <w:t>B1-!</w:t>
+            </w:r>
+            <w:proofErr w:type="gramStart"/>
+            <w:r>
+              <w:rPr>
+                <w:rFonts w:ascii="Calibri" w:eastAsia="Times New Roman" w:hAnsi="Calibri" w:cs="Calibri"/>
+                <w:color w:val="000000"/>
+                <w:kern w:val="0"/>
+                <w14:ligatures w14:val="none"/>
+              </w:rPr>
+              <w:t>1;=</w:t>
+            </w:r>
+            <w:proofErr w:type="gramEnd"/>
+            <w:r>
+              <w:rPr>
+                <w:rFonts w:ascii="Calibri" w:eastAsia="Times New Roman" w:hAnsi="Calibri" w:cs="Calibri"/>
+                <w:color w:val="000000"/>
+                <w:kern w:val="0"/>
+                <w14:ligatures w14:val="none"/>
+              </w:rPr>
+              <w:t>C</w:t>
             </w:r>
           </w:p>
         </w:tc>
@@ -13077,7 +13025,7 @@
                 <w:kern w:val="0"/>
                 <w14:ligatures w14:val="none"/>
               </w:rPr>
-              <w:t>GIVE</w:t>
+              <w:t>EXPAND/VISUALIZE</w:t>
             </w:r>
           </w:p>
         </w:tc>
@@ -13111,18 +13059,18 @@
                 <w:kern w:val="0"/>
                 <w14:ligatures w14:val="none"/>
               </w:rPr>
-              <w:t>o</w:t>
-            </w:r>
-            <w:r>
-              <w:rPr>
-                <w:rFonts w:ascii="Calibri" w:eastAsia="Times New Roman" w:hAnsi="Calibri" w:cs="Calibri"/>
-                <w:color w:val="000000"/>
-                <w:kern w:val="0"/>
-                <w14:ligatures w14:val="none"/>
-              </w:rPr>
-              <w:t>,-!;</w:t>
+              <w:t>!u</w:t>
             </w:r>
             <w:proofErr w:type="gramEnd"/>
+            <w:r>
+              <w:rPr>
+                <w:rFonts w:ascii="Calibri" w:eastAsia="Times New Roman" w:hAnsi="Calibri" w:cs="Calibri"/>
+                <w:color w:val="000000"/>
+                <w:kern w:val="0"/>
+                <w14:ligatures w14:val="none"/>
+              </w:rPr>
+              <w:t>/7-c'/=s/1=s7=c'|!u1</w:t>
+            </w:r>
           </w:p>
         </w:tc>
       </w:tr>
@@ -13161,7 +13109,7 @@
                 <w:kern w:val="0"/>
                 <w14:ligatures w14:val="none"/>
               </w:rPr>
-              <w:t xml:space="preserve">GO AHEAD </w:t>
+              <w:t>FAMILY</w:t>
             </w:r>
           </w:p>
         </w:tc>
@@ -13188,15 +13136,6 @@
                 <w14:ligatures w14:val="none"/>
               </w:rPr>
             </w:pPr>
-            <w:r>
-              <w:rPr>
-                <w:rFonts w:ascii="Calibri" w:eastAsia="Times New Roman" w:hAnsi="Calibri" w:cs="Calibri"/>
-                <w:color w:val="000000"/>
-                <w:kern w:val="0"/>
-                <w14:ligatures w14:val="none"/>
-              </w:rPr>
-              <w:t>C</w:t>
-            </w:r>
             <w:proofErr w:type="gramStart"/>
             <w:r>
               <w:rPr>
@@ -13205,7 +13144,7 @@
                 <w:kern w:val="0"/>
                 <w14:ligatures w14:val="none"/>
               </w:rPr>
-              <w:t>/.=!;</w:t>
+              <w:t>!c</w:t>
             </w:r>
             <w:proofErr w:type="gramEnd"/>
             <w:r>
@@ -13215,7 +13154,43 @@
                 <w:kern w:val="0"/>
                 <w14:ligatures w14:val="none"/>
               </w:rPr>
-              <w:t>=C.</w:t>
+              <w:t>=5/.|</w:t>
+            </w:r>
+            <w:r>
+              <w:rPr>
+                <w:rFonts w:ascii="Calibri" w:eastAsia="Times New Roman" w:hAnsi="Calibri" w:cs="Calibri"/>
+                <w:color w:val="000000"/>
+                <w:kern w:val="0"/>
+                <w14:ligatures w14:val="none"/>
+              </w:rPr>
+              <w:t>o</w:t>
+            </w:r>
+            <w:r>
+              <w:rPr>
+                <w:rFonts w:ascii="Calibri" w:eastAsia="Times New Roman" w:hAnsi="Calibri" w:cs="Calibri"/>
+                <w:color w:val="000000"/>
+                <w:kern w:val="0"/>
+                <w14:ligatures w14:val="none"/>
+              </w:rPr>
+              <w:t>/'=</w:t>
+            </w:r>
+            <w:r>
+              <w:rPr>
+                <w:rFonts w:ascii="Calibri" w:eastAsia="Times New Roman" w:hAnsi="Calibri" w:cs="Calibri"/>
+                <w:color w:val="000000"/>
+                <w:kern w:val="0"/>
+                <w14:ligatures w14:val="none"/>
+              </w:rPr>
+              <w:t>o</w:t>
+            </w:r>
+            <w:r>
+              <w:rPr>
+                <w:rFonts w:ascii="Calibri" w:eastAsia="Times New Roman" w:hAnsi="Calibri" w:cs="Calibri"/>
+                <w:color w:val="000000"/>
+                <w:kern w:val="0"/>
+                <w14:ligatures w14:val="none"/>
+              </w:rPr>
+              <w:t>'|5.=!c/</w:t>
             </w:r>
           </w:p>
         </w:tc>
@@ -13254,7 +13229,7 @@
                 <w:kern w:val="0"/>
                 <w14:ligatures w14:val="none"/>
               </w:rPr>
-              <w:t>GROW</w:t>
+              <w:t>FEEL</w:t>
             </w:r>
           </w:p>
         </w:tc>
@@ -13287,7 +13262,7 @@
                 <w:kern w:val="0"/>
                 <w14:ligatures w14:val="none"/>
               </w:rPr>
-              <w:t>c/</w:t>
+              <w:t>}</w:t>
             </w:r>
             <w:proofErr w:type="gramStart"/>
             <w:r>
@@ -13297,7 +13272,7 @@
                 <w:kern w:val="0"/>
                 <w14:ligatures w14:val="none"/>
               </w:rPr>
-              <w:t>| !</w:t>
+              <w:t>].=</w:t>
             </w:r>
             <w:proofErr w:type="gramEnd"/>
             <w:r>
@@ -13307,25 +13282,7 @@
                 <w:kern w:val="0"/>
                 <w14:ligatures w14:val="none"/>
               </w:rPr>
-              <w:t xml:space="preserve">t. </w:t>
-            </w:r>
-            <w:r>
-              <w:rPr>
-                <w:rFonts w:ascii="Calibri" w:eastAsia="Times New Roman" w:hAnsi="Calibri" w:cs="Calibri"/>
-                <w:color w:val="000000"/>
-                <w:kern w:val="0"/>
-                <w14:ligatures w14:val="none"/>
-              </w:rPr>
-              <w:t>o</w:t>
-            </w:r>
-            <w:r>
-              <w:rPr>
-                <w:rFonts w:ascii="Calibri" w:eastAsia="Times New Roman" w:hAnsi="Calibri" w:cs="Calibri"/>
-                <w:color w:val="000000"/>
-                <w:kern w:val="0"/>
-                <w14:ligatures w14:val="none"/>
-              </w:rPr>
-              <w:t>2,|5/;;</w:t>
+              <w:t>!c;=W</w:t>
             </w:r>
           </w:p>
         </w:tc>
@@ -13364,7 +13321,7 @@
                 <w:kern w:val="0"/>
                 <w14:ligatures w14:val="none"/>
               </w:rPr>
-              <w:t>HELLO</w:t>
+              <w:t>FEW</w:t>
             </w:r>
           </w:p>
         </w:tc>
@@ -13390,26 +13347,6 @@
                 <w14:ligatures w14:val="none"/>
               </w:rPr>
             </w:pPr>
-            <w:proofErr w:type="gramStart"/>
-            <w:r>
-              <w:rPr>
-                <w:rFonts w:ascii="Calibri" w:eastAsia="Times New Roman" w:hAnsi="Calibri" w:cs="Calibri"/>
-                <w:color w:val="000000"/>
-                <w:kern w:val="0"/>
-                <w14:ligatures w14:val="none"/>
-              </w:rPr>
-              <w:t>}.-</w:t>
-            </w:r>
-            <w:proofErr w:type="gramEnd"/>
-            <w:r>
-              <w:rPr>
-                <w:rFonts w:ascii="Calibri" w:eastAsia="Times New Roman" w:hAnsi="Calibri" w:cs="Calibri"/>
-                <w:color w:val="000000"/>
-                <w:kern w:val="0"/>
-                <w14:ligatures w14:val="none"/>
-              </w:rPr>
-              <w:t>!c2'-b1</w:t>
-            </w:r>
           </w:p>
         </w:tc>
       </w:tr>
@@ -13447,7 +13384,7 @@
                 <w:kern w:val="0"/>
                 <w14:ligatures w14:val="none"/>
               </w:rPr>
-              <w:t>HELP</w:t>
+              <w:t>FOLLOW</w:t>
             </w:r>
           </w:p>
         </w:tc>
@@ -13480,7 +13417,7 @@
                 <w:kern w:val="0"/>
                 <w14:ligatures w14:val="none"/>
               </w:rPr>
-              <w:t>B2.-A2</w:t>
+              <w:t>}] !</w:t>
             </w:r>
             <w:proofErr w:type="gramStart"/>
             <w:r>
@@ -13490,9 +13427,18 @@
                 <w:kern w:val="0"/>
                 <w14:ligatures w14:val="none"/>
               </w:rPr>
-              <w:t>; !t</w:t>
+              <w:t>2,|</w:t>
             </w:r>
             <w:proofErr w:type="gramEnd"/>
+            <w:r>
+              <w:rPr>
+                <w:rFonts w:ascii="Calibri" w:eastAsia="Times New Roman" w:hAnsi="Calibri" w:cs="Calibri"/>
+                <w:color w:val="000000"/>
+                <w:kern w:val="0"/>
+                <w14:ligatures w14:val="none"/>
+              </w:rPr>
+              <w:t>A2; A2;</w:t>
+            </w:r>
           </w:p>
         </w:tc>
       </w:tr>
@@ -13530,7 +13476,7 @@
                 <w:kern w:val="0"/>
                 <w14:ligatures w14:val="none"/>
               </w:rPr>
-              <w:t>HERE</w:t>
+              <w:t>FOOD</w:t>
             </w:r>
           </w:p>
         </w:tc>
@@ -13556,15 +13502,6 @@
                 <w14:ligatures w14:val="none"/>
               </w:rPr>
             </w:pPr>
-            <w:r>
-              <w:rPr>
-                <w:rFonts w:ascii="Calibri" w:eastAsia="Times New Roman" w:hAnsi="Calibri" w:cs="Calibri"/>
-                <w:color w:val="000000"/>
-                <w:kern w:val="0"/>
-                <w14:ligatures w14:val="none"/>
-              </w:rPr>
-              <w:t>B</w:t>
-            </w:r>
             <w:proofErr w:type="gramStart"/>
             <w:r>
               <w:rPr>
@@ -13573,7 +13510,7 @@
                 <w:kern w:val="0"/>
                 <w14:ligatures w14:val="none"/>
               </w:rPr>
-              <w:t>|!R</w:t>
+              <w:t>:2..</w:t>
             </w:r>
             <w:proofErr w:type="gramEnd"/>
             <w:r>
@@ -13583,7 +13520,25 @@
                 <w:kern w:val="0"/>
                 <w14:ligatures w14:val="none"/>
               </w:rPr>
-              <w:t>, !R/,| B/</w:t>
+              <w:t>| }=</w:t>
+            </w:r>
+            <w:r>
+              <w:rPr>
+                <w:rFonts w:ascii="Calibri" w:eastAsia="Times New Roman" w:hAnsi="Calibri" w:cs="Calibri"/>
+                <w:color w:val="000000"/>
+                <w:kern w:val="0"/>
+                <w14:ligatures w14:val="none"/>
+              </w:rPr>
+              <w:t>o</w:t>
+            </w:r>
+            <w:r>
+              <w:rPr>
+                <w:rFonts w:ascii="Calibri" w:eastAsia="Times New Roman" w:hAnsi="Calibri" w:cs="Calibri"/>
+                <w:color w:val="000000"/>
+                <w:kern w:val="0"/>
+                <w14:ligatures w14:val="none"/>
+              </w:rPr>
+              <w:t>,</w:t>
             </w:r>
           </w:p>
         </w:tc>
@@ -13622,7 +13577,7 @@
                 <w:kern w:val="0"/>
                 <w14:ligatures w14:val="none"/>
               </w:rPr>
-              <w:t>HOME</w:t>
+              <w:t>FIND</w:t>
             </w:r>
           </w:p>
         </w:tc>
@@ -13648,35 +13603,6 @@
                 <w14:ligatures w14:val="none"/>
               </w:rPr>
             </w:pPr>
-            <w:r>
-              <w:rPr>
-                <w:rFonts w:ascii="Calibri" w:eastAsia="Times New Roman" w:hAnsi="Calibri" w:cs="Calibri"/>
-                <w:color w:val="000000"/>
-                <w:kern w:val="0"/>
-                <w14:ligatures w14:val="none"/>
-              </w:rPr>
-              <w:t>[u4- @:</w:t>
-            </w:r>
-            <w:proofErr w:type="gramStart"/>
-            <w:r>
-              <w:rPr>
-                <w:rFonts w:ascii="Calibri" w:eastAsia="Times New Roman" w:hAnsi="Calibri" w:cs="Calibri"/>
-                <w:color w:val="000000"/>
-                <w:kern w:val="0"/>
-                <w14:ligatures w14:val="none"/>
-              </w:rPr>
-              <w:t>1;=</w:t>
-            </w:r>
-            <w:proofErr w:type="gramEnd"/>
-            <w:r>
-              <w:rPr>
-                <w:rFonts w:ascii="Calibri" w:eastAsia="Times New Roman" w:hAnsi="Calibri" w:cs="Calibri"/>
-                <w:color w:val="000000"/>
-                <w:kern w:val="0"/>
-                <w14:ligatures w14:val="none"/>
-              </w:rPr>
-              <w:t>o</w:t>
-            </w:r>
           </w:p>
         </w:tc>
       </w:tr>
@@ -13714,7 +13640,7 @@
                 <w:kern w:val="0"/>
                 <w14:ligatures w14:val="none"/>
               </w:rPr>
-              <w:t>HOPE</w:t>
+              <w:t>FINE</w:t>
             </w:r>
           </w:p>
         </w:tc>
@@ -13733,42 +13659,23 @@
           <w:p>
             <w:pPr>
               <w:spacing w:after="0" w:line="240" w:lineRule="auto"/>
-              <w:rPr>
-                <w:rFonts w:ascii="Calibri" w:eastAsia="Times New Roman" w:hAnsi="Calibri" w:cs="Calibri"/>
-                <w:color w:val="000000"/>
-                <w:kern w:val="0"/>
-                <w14:ligatures w14:val="none"/>
-              </w:rPr>
-            </w:pPr>
-            <w:r>
-              <w:rPr>
-                <w:rFonts w:ascii="Calibri" w:eastAsia="Times New Roman" w:hAnsi="Calibri" w:cs="Calibri"/>
-                <w:color w:val="000000"/>
-                <w:kern w:val="0"/>
-                <w14:ligatures w14:val="none"/>
-              </w:rPr>
-              <w:t>C/- [u'| @s</w:t>
+            </w:pPr>
+            <w:r>
+              <w:t>:</w:t>
             </w:r>
             <w:proofErr w:type="gramStart"/>
             <w:r>
-              <w:rPr>
-                <w:rFonts w:ascii="Calibri" w:eastAsia="Times New Roman" w:hAnsi="Calibri" w:cs="Calibri"/>
-                <w:color w:val="000000"/>
-                <w:kern w:val="0"/>
-                <w14:ligatures w14:val="none"/>
-              </w:rPr>
-              <w:t>7;;</w:t>
+              <w:t>2;=</w:t>
             </w:r>
             <w:proofErr w:type="gramEnd"/>
             <w:r>
-              <w:rPr>
-                <w:rFonts w:ascii="Calibri" w:eastAsia="Times New Roman" w:hAnsi="Calibri" w:cs="Calibri"/>
-                <w:color w:val="000000"/>
-                <w:kern w:val="0"/>
-                <w14:ligatures w14:val="none"/>
-              </w:rPr>
-              <w:t>=@s5;;-C</w:t>
-            </w:r>
+              <w:t xml:space="preserve">}]. </w:t>
+            </w:r>
+            <w:proofErr w:type="gramStart"/>
+            <w:r>
+              <w:t>5;;</w:t>
+            </w:r>
+            <w:proofErr w:type="gramEnd"/>
           </w:p>
         </w:tc>
       </w:tr>
@@ -13788,7 +13695,6 @@
             <w:shd w:val="clear" w:color="auto" w:fill="auto"/>
             <w:noWrap/>
             <w:vAlign w:val="center"/>
-            <w:hideMark/>
           </w:tcPr>
           <w:p>
             <w:pPr>
@@ -13807,7 +13713,7 @@
                 <w:kern w:val="0"/>
                 <w14:ligatures w14:val="none"/>
               </w:rPr>
-              <w:t xml:space="preserve">I/ME </w:t>
+              <w:t>FINGERSPELL</w:t>
             </w:r>
           </w:p>
         </w:tc>
@@ -13822,26 +13728,21 @@
             </w:tcBorders>
             <w:shd w:val="clear" w:color="auto" w:fill="auto"/>
             <w:vAlign w:val="center"/>
-            <w:hideMark/>
           </w:tcPr>
           <w:p>
             <w:pPr>
               <w:spacing w:after="0" w:line="240" w:lineRule="auto"/>
-              <w:rPr>
-                <w:rFonts w:ascii="Calibri" w:eastAsia="Times New Roman" w:hAnsi="Calibri" w:cs="Calibri"/>
-                <w:color w:val="000000"/>
-                <w:kern w:val="0"/>
-                <w14:ligatures w14:val="none"/>
-              </w:rPr>
-            </w:pPr>
-            <w:r>
-              <w:rPr>
-                <w:rFonts w:ascii="Calibri" w:eastAsia="Times New Roman" w:hAnsi="Calibri" w:cs="Calibri"/>
-                <w:color w:val="000000"/>
-                <w:kern w:val="0"/>
-                <w14:ligatures w14:val="none"/>
-              </w:rPr>
-              <w:t>14=!4.</w:t>
+            </w:pPr>
+            <w:r>
+              <w:t>5|@w'</w:t>
+            </w:r>
+            <w:proofErr w:type="gramStart"/>
+            <w:r>
+              <w:t>|!:</w:t>
+            </w:r>
+            <w:proofErr w:type="gramEnd"/>
+            <w:r>
+              <w:t>2,</w:t>
             </w:r>
           </w:p>
         </w:tc>
@@ -13880,7 +13781,7 @@
                 <w:kern w:val="0"/>
                 <w14:ligatures w14:val="none"/>
               </w:rPr>
-              <w:t>IMPACT</w:t>
+              <w:t>FINISH</w:t>
             </w:r>
           </w:p>
         </w:tc>
@@ -13899,41 +13800,9 @@
           <w:p>
             <w:pPr>
               <w:spacing w:after="0" w:line="240" w:lineRule="auto"/>
-              <w:rPr>
-                <w:rFonts w:ascii="Calibri" w:eastAsia="Times New Roman" w:hAnsi="Calibri" w:cs="Calibri"/>
-                <w:color w:val="000000"/>
-                <w:kern w:val="0"/>
-                <w14:ligatures w14:val="none"/>
-              </w:rPr>
-            </w:pPr>
-            <w:r>
-              <w:rPr>
-                <w:rFonts w:ascii="Calibri" w:eastAsia="Times New Roman" w:hAnsi="Calibri" w:cs="Calibri"/>
-                <w:color w:val="000000"/>
-                <w:kern w:val="0"/>
-                <w14:ligatures w14:val="none"/>
-              </w:rPr>
-              <w:t>1</w:t>
-            </w:r>
-            <w:proofErr w:type="gramStart"/>
-            <w:r>
-              <w:rPr>
-                <w:rFonts w:ascii="Calibri" w:eastAsia="Times New Roman" w:hAnsi="Calibri" w:cs="Calibri"/>
-                <w:color w:val="000000"/>
-                <w:kern w:val="0"/>
-                <w14:ligatures w14:val="none"/>
-              </w:rPr>
-              <w:t>=.;;</w:t>
-            </w:r>
-            <w:proofErr w:type="gramEnd"/>
-            <w:r>
-              <w:rPr>
-                <w:rFonts w:ascii="Calibri" w:eastAsia="Times New Roman" w:hAnsi="Calibri" w:cs="Calibri"/>
-                <w:color w:val="000000"/>
-                <w:kern w:val="0"/>
-                <w14:ligatures w14:val="none"/>
-              </w:rPr>
-              <w:t xml:space="preserve"> s;;</w:t>
+            </w:pPr>
+            <w:r>
+              <w:t>5-@o, 5/-@o,</w:t>
             </w:r>
           </w:p>
         </w:tc>
@@ -13954,6 +13823,7 @@
             <w:shd w:val="clear" w:color="auto" w:fill="auto"/>
             <w:noWrap/>
             <w:vAlign w:val="center"/>
+            <w:hideMark/>
           </w:tcPr>
           <w:p>
             <w:pPr>
@@ -13972,7 +13842,7 @@
                 <w:kern w:val="0"/>
                 <w14:ligatures w14:val="none"/>
               </w:rPr>
-              <w:t>IMPORTANT</w:t>
+              <w:t xml:space="preserve">FIRST </w:t>
             </w:r>
           </w:p>
         </w:tc>
@@ -13987,6 +13857,7 @@
             </w:tcBorders>
             <w:shd w:val="clear" w:color="auto" w:fill="auto"/>
             <w:vAlign w:val="center"/>
+            <w:hideMark/>
           </w:tcPr>
           <w:p>
             <w:pPr>
@@ -14005,27 +13876,7 @@
                 <w:kern w:val="0"/>
                 <w14:ligatures w14:val="none"/>
               </w:rPr>
-              <w:t>k7</w:t>
-            </w:r>
-            <w:proofErr w:type="gramStart"/>
-            <w:r>
-              <w:rPr>
-                <w:rFonts w:ascii="Calibri" w:eastAsia="Times New Roman" w:hAnsi="Calibri" w:cs="Calibri"/>
-                <w:color w:val="000000"/>
-                <w:kern w:val="0"/>
-                <w14:ligatures w14:val="none"/>
-              </w:rPr>
-              <w:t>/,|</w:t>
-            </w:r>
-            <w:proofErr w:type="gramEnd"/>
-            <w:r>
-              <w:rPr>
-                <w:rFonts w:ascii="Calibri" w:eastAsia="Times New Roman" w:hAnsi="Calibri" w:cs="Calibri"/>
-                <w:color w:val="000000"/>
-                <w:kern w:val="0"/>
-                <w14:ligatures w14:val="none"/>
-              </w:rPr>
-              <w:t xml:space="preserve"> !u1;|_!u7/;| k1,</w:t>
+              <w:t>1;|@o.</w:t>
             </w:r>
           </w:p>
         </w:tc>
@@ -14064,7 +13915,7 @@
                 <w:kern w:val="0"/>
                 <w14:ligatures w14:val="none"/>
               </w:rPr>
-              <w:t>IMPROVE</w:t>
+              <w:t>FOR</w:t>
             </w:r>
           </w:p>
         </w:tc>
@@ -14090,15 +13941,6 @@
                 <w14:ligatures w14:val="none"/>
               </w:rPr>
             </w:pPr>
-            <w:r>
-              <w:rPr>
-                <w:rFonts w:ascii="Calibri" w:eastAsia="Times New Roman" w:hAnsi="Calibri" w:cs="Calibri"/>
-                <w:color w:val="000000"/>
-                <w:kern w:val="0"/>
-                <w14:ligatures w14:val="none"/>
-              </w:rPr>
-              <w:t>[a</w:t>
-            </w:r>
             <w:proofErr w:type="gramStart"/>
             <w:r>
               <w:rPr>
@@ -14107,7 +13949,7 @@
                 <w:kern w:val="0"/>
                 <w14:ligatures w14:val="none"/>
               </w:rPr>
-              <w:t>| !c</w:t>
+              <w:t>}~</w:t>
             </w:r>
             <w:proofErr w:type="gramEnd"/>
             <w:r>
@@ -14117,7 +13959,7 @@
                 <w:kern w:val="0"/>
                 <w14:ligatures w14:val="none"/>
               </w:rPr>
-              <w:t>6/=B/7;</w:t>
+              <w:t>|17-!2;-@o..</w:t>
             </w:r>
           </w:p>
         </w:tc>
@@ -14156,7 +13998,7 @@
                 <w:kern w:val="0"/>
                 <w14:ligatures w14:val="none"/>
               </w:rPr>
-              <w:t>IN</w:t>
+              <w:t>FORGET</w:t>
             </w:r>
           </w:p>
         </w:tc>
@@ -14189,7 +14031,7 @@
                 <w:kern w:val="0"/>
                 <w14:ligatures w14:val="none"/>
               </w:rPr>
-              <w:t>c./</w:t>
+              <w:t>[u-B/6-!</w:t>
             </w:r>
             <w:proofErr w:type="gramStart"/>
             <w:r>
@@ -14199,7 +14041,7 @@
                 <w:kern w:val="0"/>
                 <w14:ligatures w14:val="none"/>
               </w:rPr>
-              <w:t>-!t</w:t>
+              <w:t>2,-</w:t>
             </w:r>
             <w:proofErr w:type="gramEnd"/>
             <w:r>
@@ -14209,7 +14051,7 @@
                 <w:kern w:val="0"/>
                 <w14:ligatures w14:val="none"/>
               </w:rPr>
-              <w:t>4;=o6'</w:t>
+              <w:t xml:space="preserve"> a/</w:t>
             </w:r>
           </w:p>
         </w:tc>
@@ -14248,7 +14090,7 @@
                 <w:kern w:val="0"/>
                 <w14:ligatures w14:val="none"/>
               </w:rPr>
-              <w:t>KNOW</w:t>
+              <w:t>FRIEND</w:t>
             </w:r>
           </w:p>
         </w:tc>
@@ -14281,7 +14123,7 @@
                 <w:kern w:val="0"/>
                 <w14:ligatures w14:val="none"/>
               </w:rPr>
-              <w:t>:</w:t>
+              <w:t>@</w:t>
             </w:r>
             <w:proofErr w:type="gramStart"/>
             <w:r>
@@ -14291,7 +14133,7 @@
                 <w:kern w:val="0"/>
                 <w14:ligatures w14:val="none"/>
               </w:rPr>
-              <w:t>2;=</w:t>
+              <w:t>o..|</w:t>
             </w:r>
             <w:proofErr w:type="gramEnd"/>
             <w:r>
@@ -14301,7 +14143,7 @@
                 <w:kern w:val="0"/>
                 <w14:ligatures w14:val="none"/>
               </w:rPr>
-              <w:t>}~=C</w:t>
+              <w:t>x1| x7.=@o,</w:t>
             </w:r>
           </w:p>
         </w:tc>
@@ -14322,7 +14164,6 @@
             <w:shd w:val="clear" w:color="auto" w:fill="auto"/>
             <w:noWrap/>
             <w:vAlign w:val="center"/>
-            <w:hideMark/>
           </w:tcPr>
           <w:p>
             <w:pPr>
@@ -14342,7 +14183,7 @@
                 <w14:ligatures w14:val="none"/>
               </w:rPr>
               <w:lastRenderedPageBreak/>
-              <w:t xml:space="preserve">LIVE </w:t>
+              <w:t>GET</w:t>
             </w:r>
           </w:p>
         </w:tc>
@@ -14357,7 +14198,6 @@
             </w:tcBorders>
             <w:shd w:val="clear" w:color="auto" w:fill="auto"/>
             <w:vAlign w:val="center"/>
-            <w:hideMark/>
           </w:tcPr>
           <w:p>
             <w:pPr>
@@ -14369,15 +14209,6 @@
                 <w14:ligatures w14:val="none"/>
               </w:rPr>
             </w:pPr>
-            <w:r>
-              <w:rPr>
-                <w:rFonts w:ascii="Calibri" w:eastAsia="Times New Roman" w:hAnsi="Calibri" w:cs="Calibri"/>
-                <w:color w:val="000000"/>
-                <w:kern w:val="0"/>
-                <w14:ligatures w14:val="none"/>
-              </w:rPr>
-              <w:t>['| A6/</w:t>
-            </w:r>
             <w:proofErr w:type="gramStart"/>
             <w:r>
               <w:rPr>
@@ -14386,7 +14217,7 @@
                 <w:kern w:val="0"/>
                 <w14:ligatures w14:val="none"/>
               </w:rPr>
-              <w:t>= !</w:t>
+              <w:t>}]=</w:t>
             </w:r>
             <w:proofErr w:type="gramEnd"/>
             <w:r>
@@ -14396,7 +14227,7 @@
                 <w:kern w:val="0"/>
                 <w14:ligatures w14:val="none"/>
               </w:rPr>
-              <w:t>= A2</w:t>
+              <w:t>s;|s/,-!6.-c4;|c/,</w:t>
             </w:r>
           </w:p>
         </w:tc>
@@ -14435,7 +14266,7 @@
                 <w:kern w:val="0"/>
                 <w14:ligatures w14:val="none"/>
               </w:rPr>
-              <w:t>MAKE</w:t>
+              <w:t>GIRL</w:t>
             </w:r>
           </w:p>
         </w:tc>
@@ -14461,15 +14292,6 @@
                 <w14:ligatures w14:val="none"/>
               </w:rPr>
             </w:pPr>
-            <w:r>
-              <w:rPr>
-                <w:rFonts w:ascii="Calibri" w:eastAsia="Times New Roman" w:hAnsi="Calibri" w:cs="Calibri"/>
-                <w:color w:val="000000"/>
-                <w:kern w:val="0"/>
-                <w14:ligatures w14:val="none"/>
-              </w:rPr>
-              <w:t>s</w:t>
-            </w:r>
             <w:proofErr w:type="gramStart"/>
             <w:r>
               <w:rPr>
@@ -14478,7 +14300,7 @@
                 <w:kern w:val="0"/>
                 <w14:ligatures w14:val="none"/>
               </w:rPr>
-              <w:t>2.|</w:t>
+              <w:t>}~</w:t>
             </w:r>
             <w:proofErr w:type="gramEnd"/>
             <w:r>
@@ -14488,7 +14310,7 @@
                 <w:kern w:val="0"/>
                 <w14:ligatures w14:val="none"/>
               </w:rPr>
-              <w:t xml:space="preserve"> :2;|s'6/=@c7;;</w:t>
+              <w:t>/4;|!3.=A2</w:t>
             </w:r>
           </w:p>
         </w:tc>
@@ -14509,7 +14331,6 @@
             <w:shd w:val="clear" w:color="auto" w:fill="auto"/>
             <w:noWrap/>
             <w:vAlign w:val="center"/>
-            <w:hideMark/>
           </w:tcPr>
           <w:p>
             <w:pPr>
@@ -14528,7 +14349,7 @@
                 <w:kern w:val="0"/>
                 <w14:ligatures w14:val="none"/>
               </w:rPr>
-              <w:t xml:space="preserve">MAN </w:t>
+              <w:t>GIVE</w:t>
             </w:r>
           </w:p>
         </w:tc>
@@ -14543,7 +14364,6 @@
             </w:tcBorders>
             <w:shd w:val="clear" w:color="auto" w:fill="auto"/>
             <w:vAlign w:val="center"/>
-            <w:hideMark/>
           </w:tcPr>
           <w:p>
             <w:pPr>
@@ -14563,18 +14383,18 @@
                 <w:kern w:val="0"/>
                 <w14:ligatures w14:val="none"/>
               </w:rPr>
-              <w:t>}~</w:t>
+              <w:t>o</w:t>
+            </w:r>
+            <w:r>
+              <w:rPr>
+                <w:rFonts w:ascii="Calibri" w:eastAsia="Times New Roman" w:hAnsi="Calibri" w:cs="Calibri"/>
+                <w:color w:val="000000"/>
+                <w:kern w:val="0"/>
+                <w14:ligatures w14:val="none"/>
+              </w:rPr>
+              <w:t>,-!;</w:t>
             </w:r>
             <w:proofErr w:type="gramEnd"/>
-            <w:r>
-              <w:rPr>
-                <w:rFonts w:ascii="Calibri" w:eastAsia="Times New Roman" w:hAnsi="Calibri" w:cs="Calibri"/>
-                <w:color w:val="000000"/>
-                <w:kern w:val="0"/>
-                <w14:ligatures w14:val="none"/>
-              </w:rPr>
-              <w:t>=5;;=!c4.</w:t>
-            </w:r>
           </w:p>
         </w:tc>
       </w:tr>
@@ -14594,7 +14414,6 @@
             <w:shd w:val="clear" w:color="auto" w:fill="auto"/>
             <w:noWrap/>
             <w:vAlign w:val="center"/>
-            <w:hideMark/>
           </w:tcPr>
           <w:p>
             <w:pPr>
@@ -14613,7 +14432,7 @@
                 <w:kern w:val="0"/>
                 <w14:ligatures w14:val="none"/>
               </w:rPr>
-              <w:t xml:space="preserve">MEET </w:t>
+              <w:t>GO</w:t>
             </w:r>
           </w:p>
         </w:tc>
@@ -14628,7 +14447,6 @@
             </w:tcBorders>
             <w:shd w:val="clear" w:color="auto" w:fill="auto"/>
             <w:vAlign w:val="center"/>
-            <w:hideMark/>
           </w:tcPr>
           <w:p>
             <w:pPr>
@@ -14640,35 +14458,6 @@
                 <w14:ligatures w14:val="none"/>
               </w:rPr>
             </w:pPr>
-            <w:r>
-              <w:rPr>
-                <w:rFonts w:ascii="Calibri" w:eastAsia="Times New Roman" w:hAnsi="Calibri" w:cs="Calibri"/>
-                <w:color w:val="000000"/>
-                <w:kern w:val="0"/>
-                <w14:ligatures w14:val="none"/>
-              </w:rPr>
-              <w:t>1</w:t>
-            </w:r>
-            <w:proofErr w:type="gramStart"/>
-            <w:r>
-              <w:rPr>
-                <w:rFonts w:ascii="Calibri" w:eastAsia="Times New Roman" w:hAnsi="Calibri" w:cs="Calibri"/>
-                <w:color w:val="000000"/>
-                <w:kern w:val="0"/>
-                <w14:ligatures w14:val="none"/>
-              </w:rPr>
-              <w:t>|!,</w:t>
-            </w:r>
-            <w:proofErr w:type="gramEnd"/>
-            <w:r>
-              <w:rPr>
-                <w:rFonts w:ascii="Calibri" w:eastAsia="Times New Roman" w:hAnsi="Calibri" w:cs="Calibri"/>
-                <w:color w:val="000000"/>
-                <w:kern w:val="0"/>
-                <w14:ligatures w14:val="none"/>
-              </w:rPr>
-              <w:t>2=!/,6-1/</w:t>
-            </w:r>
           </w:p>
         </w:tc>
       </w:tr>
@@ -14707,7 +14496,7 @@
                 <w:kern w:val="0"/>
                 <w14:ligatures w14:val="none"/>
               </w:rPr>
-              <w:t xml:space="preserve">MY/MINE </w:t>
+              <w:t xml:space="preserve">GO AHEAD </w:t>
             </w:r>
           </w:p>
         </w:tc>
@@ -14741,7 +14530,27 @@
                 <w:kern w:val="0"/>
                 <w14:ligatures w14:val="none"/>
               </w:rPr>
-              <w:t>[;|_B/6-.</w:t>
+              <w:t>C</w:t>
+            </w:r>
+            <w:proofErr w:type="gramStart"/>
+            <w:r>
+              <w:rPr>
+                <w:rFonts w:ascii="Calibri" w:eastAsia="Times New Roman" w:hAnsi="Calibri" w:cs="Calibri"/>
+                <w:color w:val="000000"/>
+                <w:kern w:val="0"/>
+                <w14:ligatures w14:val="none"/>
+              </w:rPr>
+              <w:t>/.=!;</w:t>
+            </w:r>
+            <w:proofErr w:type="gramEnd"/>
+            <w:r>
+              <w:rPr>
+                <w:rFonts w:ascii="Calibri" w:eastAsia="Times New Roman" w:hAnsi="Calibri" w:cs="Calibri"/>
+                <w:color w:val="000000"/>
+                <w:kern w:val="0"/>
+                <w14:ligatures w14:val="none"/>
+              </w:rPr>
+              <w:t>=C.</w:t>
             </w:r>
           </w:p>
         </w:tc>
@@ -14780,7 +14589,7 @@
                 <w:kern w:val="0"/>
                 <w14:ligatures w14:val="none"/>
               </w:rPr>
-              <w:t>NAME</w:t>
+              <w:t>GROW</w:t>
             </w:r>
           </w:p>
         </w:tc>
@@ -14813,16 +14622,7 @@
                 <w:kern w:val="0"/>
                 <w14:ligatures w14:val="none"/>
               </w:rPr>
-              <w:t>h</w:t>
-            </w:r>
-            <w:r>
-              <w:rPr>
-                <w:rFonts w:ascii="Calibri" w:eastAsia="Times New Roman" w:hAnsi="Calibri" w:cs="Calibri"/>
-                <w:color w:val="000000"/>
-                <w:kern w:val="0"/>
-                <w14:ligatures w14:val="none"/>
-              </w:rPr>
-              <w:t>/</w:t>
+              <w:t>c/</w:t>
             </w:r>
             <w:proofErr w:type="gramStart"/>
             <w:r>
@@ -14832,7 +14632,7 @@
                 <w:kern w:val="0"/>
                 <w14:ligatures w14:val="none"/>
               </w:rPr>
-              <w:t>-:2;;</w:t>
+              <w:t>| !</w:t>
             </w:r>
             <w:proofErr w:type="gramEnd"/>
             <w:r>
@@ -14842,25 +14642,25 @@
                 <w:kern w:val="0"/>
                 <w14:ligatures w14:val="none"/>
               </w:rPr>
-              <w:t>-</w:t>
-            </w:r>
-            <w:r>
-              <w:rPr>
-                <w:rFonts w:ascii="Calibri" w:eastAsia="Times New Roman" w:hAnsi="Calibri" w:cs="Calibri"/>
-                <w:color w:val="000000"/>
-                <w:kern w:val="0"/>
-                <w14:ligatures w14:val="none"/>
-              </w:rPr>
-              <w:t>h</w:t>
-            </w:r>
-            <w:r>
-              <w:rPr>
-                <w:rFonts w:ascii="Calibri" w:eastAsia="Times New Roman" w:hAnsi="Calibri" w:cs="Calibri"/>
-                <w:color w:val="000000"/>
-                <w:kern w:val="0"/>
-                <w14:ligatures w14:val="none"/>
-              </w:rPr>
-              <w:t>'</w:t>
+              <w:t xml:space="preserve">t. </w:t>
+            </w:r>
+            <w:r>
+              <w:rPr>
+                <w:rFonts w:ascii="Calibri" w:eastAsia="Times New Roman" w:hAnsi="Calibri" w:cs="Calibri"/>
+                <w:color w:val="000000"/>
+                <w:kern w:val="0"/>
+                <w14:ligatures w14:val="none"/>
+              </w:rPr>
+              <w:t>o</w:t>
+            </w:r>
+            <w:r>
+              <w:rPr>
+                <w:rFonts w:ascii="Calibri" w:eastAsia="Times New Roman" w:hAnsi="Calibri" w:cs="Calibri"/>
+                <w:color w:val="000000"/>
+                <w:kern w:val="0"/>
+                <w14:ligatures w14:val="none"/>
+              </w:rPr>
+              <w:t>2,|5/;;</w:t>
             </w:r>
           </w:p>
         </w:tc>
@@ -14899,7 +14699,7 @@
                 <w:kern w:val="0"/>
                 <w14:ligatures w14:val="none"/>
               </w:rPr>
-              <w:t>NOD-HEAD-YES</w:t>
+              <w:t>HAPPY</w:t>
             </w:r>
           </w:p>
         </w:tc>
@@ -14925,25 +14725,14 @@
                 <w14:ligatures w14:val="none"/>
               </w:rPr>
             </w:pPr>
-            <w:proofErr w:type="gramStart"/>
-            <w:r>
-              <w:rPr>
-                <w:rFonts w:ascii="Calibri" w:eastAsia="Times New Roman" w:hAnsi="Calibri" w:cs="Calibri"/>
-                <w:color w:val="000000"/>
-                <w:kern w:val="0"/>
-                <w14:ligatures w14:val="none"/>
-              </w:rPr>
-              <w:t>}~</w:t>
-            </w:r>
-            <w:proofErr w:type="gramEnd"/>
-            <w:r>
-              <w:rPr>
-                <w:rFonts w:ascii="Calibri" w:eastAsia="Times New Roman" w:hAnsi="Calibri" w:cs="Calibri"/>
-                <w:color w:val="000000"/>
-                <w:kern w:val="0"/>
-                <w14:ligatures w14:val="none"/>
-              </w:rPr>
-              <w:t>|!r4/</w:t>
+            <w:r>
+              <w:rPr>
+                <w:rFonts w:ascii="Calibri" w:eastAsia="Times New Roman" w:hAnsi="Calibri" w:cs="Calibri"/>
+                <w:color w:val="000000"/>
+                <w:kern w:val="0"/>
+                <w14:ligatures w14:val="none"/>
+              </w:rPr>
+              <w:t>[;|_!:. B6/</w:t>
             </w:r>
           </w:p>
         </w:tc>
@@ -14982,7 +14771,7 @@
                 <w:kern w:val="0"/>
                 <w14:ligatures w14:val="none"/>
               </w:rPr>
-              <w:t>NOT</w:t>
+              <w:t>HAVE</w:t>
             </w:r>
           </w:p>
         </w:tc>
@@ -15008,26 +14797,6 @@
                 <w14:ligatures w14:val="none"/>
               </w:rPr>
             </w:pPr>
-            <w:proofErr w:type="gramStart"/>
-            <w:r>
-              <w:rPr>
-                <w:rFonts w:ascii="Calibri" w:eastAsia="Times New Roman" w:hAnsi="Calibri" w:cs="Calibri"/>
-                <w:color w:val="000000"/>
-                <w:kern w:val="0"/>
-                <w14:ligatures w14:val="none"/>
-              </w:rPr>
-              <w:t>}~</w:t>
-            </w:r>
-            <w:proofErr w:type="gramEnd"/>
-            <w:r>
-              <w:rPr>
-                <w:rFonts w:ascii="Calibri" w:eastAsia="Times New Roman" w:hAnsi="Calibri" w:cs="Calibri"/>
-                <w:color w:val="000000"/>
-                <w:kern w:val="0"/>
-                <w14:ligatures w14:val="none"/>
-              </w:rPr>
-              <w:t>/4-!2,| A.</w:t>
-            </w:r>
           </w:p>
         </w:tc>
       </w:tr>
@@ -15047,7 +14816,6 @@
             <w:shd w:val="clear" w:color="auto" w:fill="auto"/>
             <w:noWrap/>
             <w:vAlign w:val="center"/>
-            <w:hideMark/>
           </w:tcPr>
           <w:p>
             <w:pPr>
@@ -15066,7 +14834,7 @@
                 <w:kern w:val="0"/>
                 <w14:ligatures w14:val="none"/>
               </w:rPr>
-              <w:t>PAH</w:t>
+              <w:t>HE/SHE/IT</w:t>
             </w:r>
           </w:p>
         </w:tc>
@@ -15081,7 +14849,6 @@
             </w:tcBorders>
             <w:shd w:val="clear" w:color="auto" w:fill="auto"/>
             <w:vAlign w:val="center"/>
-            <w:hideMark/>
           </w:tcPr>
           <w:p>
             <w:pPr>
@@ -15100,7 +14867,7 @@
                 <w:kern w:val="0"/>
                 <w14:ligatures w14:val="none"/>
               </w:rPr>
-              <w:t>#p=#</w:t>
+              <w:t>!</w:t>
             </w:r>
             <w:proofErr w:type="gramStart"/>
             <w:r>
@@ -15110,7 +14877,7 @@
                 <w:kern w:val="0"/>
                 <w14:ligatures w14:val="none"/>
               </w:rPr>
-              <w:t>o !c</w:t>
+              <w:t>7;;|</w:t>
             </w:r>
             <w:proofErr w:type="gramEnd"/>
             <w:r>
@@ -15120,27 +14887,7 @@
                 <w:kern w:val="0"/>
                 <w14:ligatures w14:val="none"/>
               </w:rPr>
-              <w:t xml:space="preserve">/7'|1|@o,.  </w:t>
-            </w:r>
-            <w:proofErr w:type="gramStart"/>
-            <w:r>
-              <w:rPr>
-                <w:rFonts w:ascii="Calibri" w:eastAsia="Times New Roman" w:hAnsi="Calibri" w:cs="Calibri"/>
-                <w:color w:val="000000"/>
-                <w:kern w:val="0"/>
-                <w14:ligatures w14:val="none"/>
-              </w:rPr>
-              <w:t>!c</w:t>
-            </w:r>
-            <w:proofErr w:type="gramEnd"/>
-            <w:r>
-              <w:rPr>
-                <w:rFonts w:ascii="Calibri" w:eastAsia="Times New Roman" w:hAnsi="Calibri" w:cs="Calibri"/>
-                <w:color w:val="000000"/>
-                <w:kern w:val="0"/>
-                <w14:ligatures w14:val="none"/>
-              </w:rPr>
-              <w:t>1'-1/|@o,.</w:t>
+              <w:t>17  OR  !1;|11</w:t>
             </w:r>
           </w:p>
         </w:tc>
@@ -15179,7 +14926,7 @@
                 <w:kern w:val="0"/>
                 <w14:ligatures w14:val="none"/>
               </w:rPr>
-              <w:t>PLAN</w:t>
+              <w:t>HEARING</w:t>
             </w:r>
           </w:p>
         </w:tc>
@@ -15205,35 +14952,6 @@
                 <w14:ligatures w14:val="none"/>
               </w:rPr>
             </w:pPr>
-            <w:r>
-              <w:rPr>
-                <w:rFonts w:ascii="Calibri" w:eastAsia="Times New Roman" w:hAnsi="Calibri" w:cs="Calibri"/>
-                <w:color w:val="000000"/>
-                <w:kern w:val="0"/>
-                <w14:ligatures w14:val="none"/>
-              </w:rPr>
-              <w:t>B|_@p2|!</w:t>
-            </w:r>
-            <w:proofErr w:type="gramStart"/>
-            <w:r>
-              <w:rPr>
-                <w:rFonts w:ascii="Calibri" w:eastAsia="Times New Roman" w:hAnsi="Calibri" w:cs="Calibri"/>
-                <w:color w:val="000000"/>
-                <w:kern w:val="0"/>
-                <w14:ligatures w14:val="none"/>
-              </w:rPr>
-              <w:t>2,-</w:t>
-            </w:r>
-            <w:proofErr w:type="gramEnd"/>
-            <w:r>
-              <w:rPr>
-                <w:rFonts w:ascii="Calibri" w:eastAsia="Times New Roman" w:hAnsi="Calibri" w:cs="Calibri"/>
-                <w:color w:val="000000"/>
-                <w:kern w:val="0"/>
-                <w14:ligatures w14:val="none"/>
-              </w:rPr>
-              <w:t>B|!:2,|_@p2</w:t>
-            </w:r>
           </w:p>
         </w:tc>
       </w:tr>
@@ -15271,7 +14989,7 @@
                 <w:kern w:val="0"/>
                 <w14:ligatures w14:val="none"/>
               </w:rPr>
-              <w:t xml:space="preserve">PROGRESS </w:t>
+              <w:t>HELLO</w:t>
             </w:r>
           </w:p>
         </w:tc>
@@ -15297,15 +15015,6 @@
                 <w14:ligatures w14:val="none"/>
               </w:rPr>
             </w:pPr>
-            <w:r>
-              <w:rPr>
-                <w:rFonts w:ascii="Calibri" w:eastAsia="Times New Roman" w:hAnsi="Calibri" w:cs="Calibri"/>
-                <w:color w:val="000000"/>
-                <w:kern w:val="0"/>
-                <w14:ligatures w14:val="none"/>
-              </w:rPr>
-              <w:t>C</w:t>
-            </w:r>
             <w:proofErr w:type="gramStart"/>
             <w:r>
               <w:rPr>
@@ -15314,7 +15023,7 @@
                 <w:kern w:val="0"/>
                 <w14:ligatures w14:val="none"/>
               </w:rPr>
-              <w:t>/.-</w:t>
+              <w:t>}.-</w:t>
             </w:r>
             <w:proofErr w:type="gramEnd"/>
             <w:r>
@@ -15324,7 +15033,7 @@
                 <w:kern w:val="0"/>
                 <w14:ligatures w14:val="none"/>
               </w:rPr>
-              <w:t>@o;|C'</w:t>
+              <w:t>!c2'-b1</w:t>
             </w:r>
           </w:p>
         </w:tc>
@@ -15363,7 +15072,7 @@
                 <w:kern w:val="0"/>
                 <w14:ligatures w14:val="none"/>
               </w:rPr>
-              <w:t>RED</w:t>
+              <w:t>HELP</w:t>
             </w:r>
           </w:p>
         </w:tc>
@@ -15389,6 +15098,15 @@
                 <w14:ligatures w14:val="none"/>
               </w:rPr>
             </w:pPr>
+            <w:r>
+              <w:rPr>
+                <w:rFonts w:ascii="Calibri" w:eastAsia="Times New Roman" w:hAnsi="Calibri" w:cs="Calibri"/>
+                <w:color w:val="000000"/>
+                <w:kern w:val="0"/>
+                <w14:ligatures w14:val="none"/>
+              </w:rPr>
+              <w:t>B2.-A2</w:t>
+            </w:r>
             <w:proofErr w:type="gramStart"/>
             <w:r>
               <w:rPr>
@@ -15397,36 +15115,9 @@
                 <w:kern w:val="0"/>
                 <w14:ligatures w14:val="none"/>
               </w:rPr>
-              <w:t>}~</w:t>
+              <w:t>; !t</w:t>
             </w:r>
             <w:proofErr w:type="gramEnd"/>
-            <w:r>
-              <w:rPr>
-                <w:rFonts w:ascii="Calibri" w:eastAsia="Times New Roman" w:hAnsi="Calibri" w:cs="Calibri"/>
-                <w:color w:val="000000"/>
-                <w:kern w:val="0"/>
-                <w14:ligatures w14:val="none"/>
-              </w:rPr>
-              <w:t>4'/-@s5-</w:t>
-            </w:r>
-            <w:r>
-              <w:rPr>
-                <w:rFonts w:ascii="Calibri" w:eastAsia="Times New Roman" w:hAnsi="Calibri" w:cs="Calibri"/>
-                <w:color w:val="000000"/>
-                <w:kern w:val="0"/>
-                <w14:ligatures w14:val="none"/>
-              </w:rPr>
-              <w:t>x</w:t>
-            </w:r>
-            <w:r>
-              <w:rPr>
-                <w:rFonts w:ascii="Calibri" w:eastAsia="Times New Roman" w:hAnsi="Calibri" w:cs="Calibri"/>
-                <w:color w:val="000000"/>
-                <w:kern w:val="0"/>
-                <w14:ligatures w14:val="none"/>
-              </w:rPr>
-              <w:t>,</w:t>
-            </w:r>
           </w:p>
         </w:tc>
       </w:tr>
@@ -15446,7 +15137,6 @@
             <w:shd w:val="clear" w:color="auto" w:fill="auto"/>
             <w:noWrap/>
             <w:vAlign w:val="center"/>
-            <w:hideMark/>
           </w:tcPr>
           <w:p>
             <w:pPr>
@@ -15465,7 +15155,7 @@
                 <w:kern w:val="0"/>
                 <w14:ligatures w14:val="none"/>
               </w:rPr>
-              <w:t xml:space="preserve">REMEMBER </w:t>
+              <w:t>HERE</w:t>
             </w:r>
           </w:p>
         </w:tc>
@@ -15480,7 +15170,6 @@
             </w:tcBorders>
             <w:shd w:val="clear" w:color="auto" w:fill="auto"/>
             <w:vAlign w:val="center"/>
-            <w:hideMark/>
           </w:tcPr>
           <w:p>
             <w:pPr>
@@ -15499,7 +15188,7 @@
                 <w:kern w:val="0"/>
                 <w14:ligatures w14:val="none"/>
               </w:rPr>
-              <w:t>}-A'|!2</w:t>
+              <w:t>B</w:t>
             </w:r>
             <w:proofErr w:type="gramStart"/>
             <w:r>
@@ -15509,7 +15198,7 @@
                 <w:kern w:val="0"/>
                 <w14:ligatures w14:val="none"/>
               </w:rPr>
-              <w:t>,.-</w:t>
+              <w:t>|!R</w:t>
             </w:r>
             <w:proofErr w:type="gramEnd"/>
             <w:r>
@@ -15519,7 +15208,7 @@
                 <w:kern w:val="0"/>
                 <w14:ligatures w14:val="none"/>
               </w:rPr>
-              <w:t>!2,.-A7/- :;;2-A1  OR  }-A'|!2,.-A7/- :;;2-A1</w:t>
+              <w:t>, !R/,| B/</w:t>
             </w:r>
           </w:p>
         </w:tc>
@@ -15558,7 +15247,7 @@
                 <w:kern w:val="0"/>
                 <w14:ligatures w14:val="none"/>
               </w:rPr>
-              <w:t>RULES</w:t>
+              <w:t>HOME</w:t>
             </w:r>
           </w:p>
         </w:tc>
@@ -15591,7 +15280,7 @@
                 <w:kern w:val="0"/>
                 <w14:ligatures w14:val="none"/>
               </w:rPr>
-              <w:t>B-</w:t>
+              <w:t>[u4- @:</w:t>
             </w:r>
             <w:proofErr w:type="gramStart"/>
             <w:r>
@@ -15601,7 +15290,7 @@
                 <w:kern w:val="0"/>
                 <w14:ligatures w14:val="none"/>
               </w:rPr>
-              <w:t>:|:;;</w:t>
+              <w:t>1;=</w:t>
             </w:r>
             <w:proofErr w:type="gramEnd"/>
             <w:r>
@@ -15611,7 +15300,7 @@
                 <w:kern w:val="0"/>
                 <w14:ligatures w14:val="none"/>
               </w:rPr>
-              <w:t xml:space="preserve"> C/;</w:t>
+              <w:t>o</w:t>
             </w:r>
           </w:p>
         </w:tc>
@@ -15650,7 +15339,7 @@
                 <w:kern w:val="0"/>
                 <w14:ligatures w14:val="none"/>
               </w:rPr>
-              <w:t>RUN/OPERATE</w:t>
+              <w:t>HOPE</w:t>
             </w:r>
           </w:p>
         </w:tc>
@@ -15683,7 +15372,7 @@
                 <w:kern w:val="0"/>
                 <w14:ligatures w14:val="none"/>
               </w:rPr>
-              <w:t>B/1</w:t>
+              <w:t>C/- [u'| @s</w:t>
             </w:r>
             <w:proofErr w:type="gramStart"/>
             <w:r>
@@ -15693,7 +15382,7 @@
                 <w:kern w:val="0"/>
                 <w14:ligatures w14:val="none"/>
               </w:rPr>
-              <w:t>-!:</w:t>
+              <w:t>7;;</w:t>
             </w:r>
             <w:proofErr w:type="gramEnd"/>
             <w:r>
@@ -15703,7 +15392,7 @@
                 <w:kern w:val="0"/>
                 <w14:ligatures w14:val="none"/>
               </w:rPr>
-              <w:t>1'-B7/</w:t>
+              <w:t>=@s5;;-C</w:t>
             </w:r>
           </w:p>
         </w:tc>
@@ -15742,7 +15431,7 @@
                 <w:kern w:val="0"/>
                 <w14:ligatures w14:val="none"/>
               </w:rPr>
-              <w:t>SAME</w:t>
+              <w:t>HOW</w:t>
             </w:r>
           </w:p>
         </w:tc>
@@ -15775,7 +15464,7 @@
                 <w:kern w:val="0"/>
                 <w14:ligatures w14:val="none"/>
               </w:rPr>
-              <w:t>y</w:t>
+              <w:t>A6/=</w:t>
             </w:r>
             <w:proofErr w:type="gramStart"/>
             <w:r>
@@ -15785,7 +15474,7 @@
                 <w:kern w:val="0"/>
                 <w14:ligatures w14:val="none"/>
               </w:rPr>
-              <w:t>|!r.</w:t>
+              <w:t>@.=</w:t>
             </w:r>
             <w:proofErr w:type="gramEnd"/>
             <w:r>
@@ -15795,7 +15484,7 @@
                 <w:kern w:val="0"/>
                 <w14:ligatures w14:val="none"/>
               </w:rPr>
-              <w:t>.</w:t>
+              <w:t>A2|@s6,</w:t>
             </w:r>
           </w:p>
         </w:tc>
@@ -15816,6 +15505,7 @@
             <w:shd w:val="clear" w:color="auto" w:fill="auto"/>
             <w:noWrap/>
             <w:vAlign w:val="center"/>
+            <w:hideMark/>
           </w:tcPr>
           <w:p>
             <w:pPr>
@@ -15834,7 +15524,7 @@
                 <w:kern w:val="0"/>
                 <w14:ligatures w14:val="none"/>
               </w:rPr>
-              <w:t>SERIOUS</w:t>
+              <w:t xml:space="preserve">I/ME </w:t>
             </w:r>
           </w:p>
         </w:tc>
@@ -15849,6 +15539,7 @@
             </w:tcBorders>
             <w:shd w:val="clear" w:color="auto" w:fill="auto"/>
             <w:vAlign w:val="center"/>
+            <w:hideMark/>
           </w:tcPr>
           <w:p>
             <w:pPr>
@@ -15867,27 +15558,7 @@
                 <w:kern w:val="0"/>
                 <w14:ligatures w14:val="none"/>
               </w:rPr>
-              <w:t xml:space="preserve">[u4- </w:t>
-            </w:r>
-            <w:proofErr w:type="gramStart"/>
-            <w:r>
-              <w:rPr>
-                <w:rFonts w:ascii="Calibri" w:eastAsia="Times New Roman" w:hAnsi="Calibri" w:cs="Calibri"/>
-                <w:color w:val="000000"/>
-                <w:kern w:val="0"/>
-                <w14:ligatures w14:val="none"/>
-              </w:rPr>
-              <w:t>17.=</w:t>
-            </w:r>
-            <w:proofErr w:type="gramEnd"/>
-            <w:r>
-              <w:rPr>
-                <w:rFonts w:ascii="Calibri" w:eastAsia="Times New Roman" w:hAnsi="Calibri" w:cs="Calibri"/>
-                <w:color w:val="000000"/>
-                <w:kern w:val="0"/>
-                <w14:ligatures w14:val="none"/>
-              </w:rPr>
-              <w:t>@o,</w:t>
+              <w:t>14=!4.</w:t>
             </w:r>
           </w:p>
         </w:tc>
@@ -15926,7 +15597,7 @@
                 <w:kern w:val="0"/>
                 <w14:ligatures w14:val="none"/>
               </w:rPr>
-              <w:t>SHAKE-HEAD-NO</w:t>
+              <w:t>IMPACT</w:t>
             </w:r>
           </w:p>
         </w:tc>
@@ -15959,7 +15630,7 @@
                 <w:kern w:val="0"/>
                 <w14:ligatures w14:val="none"/>
               </w:rPr>
-              <w:t>[u</w:t>
+              <w:t>1</w:t>
             </w:r>
             <w:proofErr w:type="gramStart"/>
             <w:r>
@@ -15969,7 +15640,7 @@
                 <w:kern w:val="0"/>
                 <w14:ligatures w14:val="none"/>
               </w:rPr>
-              <w:t>| !</w:t>
+              <w:t>=.;;</w:t>
             </w:r>
             <w:proofErr w:type="gramEnd"/>
             <w:r>
@@ -15979,7 +15650,7 @@
                 <w:kern w:val="0"/>
                 <w14:ligatures w14:val="none"/>
               </w:rPr>
-              <w:t>r.</w:t>
+              <w:t xml:space="preserve"> s;;</w:t>
             </w:r>
           </w:p>
         </w:tc>
@@ -16018,7 +15689,7 @@
                 <w:kern w:val="0"/>
                 <w14:ligatures w14:val="none"/>
               </w:rPr>
-              <w:t>SPREAD</w:t>
+              <w:t>IMPORTANT</w:t>
             </w:r>
           </w:p>
         </w:tc>
@@ -16051,16 +15722,7 @@
                 <w:kern w:val="0"/>
                 <w14:ligatures w14:val="none"/>
               </w:rPr>
-              <w:t>!7-5/'-</w:t>
-            </w:r>
-            <w:r>
-              <w:rPr>
-                <w:rFonts w:ascii="Calibri" w:eastAsia="Times New Roman" w:hAnsi="Calibri" w:cs="Calibri"/>
-                <w:color w:val="000000"/>
-                <w:kern w:val="0"/>
-                <w14:ligatures w14:val="none"/>
-              </w:rPr>
-              <w:t>o</w:t>
+              <w:t>k7</w:t>
             </w:r>
             <w:proofErr w:type="gramStart"/>
             <w:r>
@@ -16070,7 +15732,7 @@
                 <w:kern w:val="0"/>
                 <w14:ligatures w14:val="none"/>
               </w:rPr>
-              <w:t>3.=</w:t>
+              <w:t>/,|</w:t>
             </w:r>
             <w:proofErr w:type="gramEnd"/>
             <w:r>
@@ -16080,16 +15742,7 @@
                 <w:kern w:val="0"/>
                 <w14:ligatures w14:val="none"/>
               </w:rPr>
-              <w:t>o</w:t>
-            </w:r>
-            <w:r>
-              <w:rPr>
-                <w:rFonts w:ascii="Calibri" w:eastAsia="Times New Roman" w:hAnsi="Calibri" w:cs="Calibri"/>
-                <w:color w:val="000000"/>
-                <w:kern w:val="0"/>
-                <w14:ligatures w14:val="none"/>
-              </w:rPr>
-              <w:t>/5.-5'-!1</w:t>
+              <w:t xml:space="preserve"> !u1;|_!u7/;| k1,</w:t>
             </w:r>
           </w:p>
         </w:tc>
@@ -16128,7 +15781,7 @@
                 <w:kern w:val="0"/>
                 <w14:ligatures w14:val="none"/>
               </w:rPr>
-              <w:t>STILL</w:t>
+              <w:t>IMPROVE</w:t>
             </w:r>
           </w:p>
         </w:tc>
@@ -16161,7 +15814,27 @@
                 <w:kern w:val="0"/>
                 <w14:ligatures w14:val="none"/>
               </w:rPr>
-              <w:t>@o| y2 y6/=@o</w:t>
+              <w:t>[a</w:t>
+            </w:r>
+            <w:proofErr w:type="gramStart"/>
+            <w:r>
+              <w:rPr>
+                <w:rFonts w:ascii="Calibri" w:eastAsia="Times New Roman" w:hAnsi="Calibri" w:cs="Calibri"/>
+                <w:color w:val="000000"/>
+                <w:kern w:val="0"/>
+                <w14:ligatures w14:val="none"/>
+              </w:rPr>
+              <w:t>| !c</w:t>
+            </w:r>
+            <w:proofErr w:type="gramEnd"/>
+            <w:r>
+              <w:rPr>
+                <w:rFonts w:ascii="Calibri" w:eastAsia="Times New Roman" w:hAnsi="Calibri" w:cs="Calibri"/>
+                <w:color w:val="000000"/>
+                <w:kern w:val="0"/>
+                <w14:ligatures w14:val="none"/>
+              </w:rPr>
+              <w:t>6/=B/7;</w:t>
             </w:r>
           </w:p>
         </w:tc>
@@ -16200,7 +15873,7 @@
                 <w:kern w:val="0"/>
                 <w14:ligatures w14:val="none"/>
               </w:rPr>
-              <w:t>STORY</w:t>
+              <w:t>IN</w:t>
             </w:r>
           </w:p>
         </w:tc>
@@ -16233,16 +15906,7 @@
                 <w:kern w:val="0"/>
                 <w14:ligatures w14:val="none"/>
               </w:rPr>
-              <w:t>o</w:t>
-            </w:r>
-            <w:r>
-              <w:rPr>
-                <w:rFonts w:ascii="Calibri" w:eastAsia="Times New Roman" w:hAnsi="Calibri" w:cs="Calibri"/>
-                <w:color w:val="000000"/>
-                <w:kern w:val="0"/>
-                <w14:ligatures w14:val="none"/>
-              </w:rPr>
-              <w:t>/</w:t>
+              <w:t>c./</w:t>
             </w:r>
             <w:proofErr w:type="gramStart"/>
             <w:r>
@@ -16252,7 +15916,7 @@
                 <w:kern w:val="0"/>
                 <w14:ligatures w14:val="none"/>
               </w:rPr>
-              <w:t>-!:</w:t>
+              <w:t>-!t</w:t>
             </w:r>
             <w:proofErr w:type="gramEnd"/>
             <w:r>
@@ -16262,16 +15926,7 @@
                 <w:kern w:val="0"/>
                 <w14:ligatures w14:val="none"/>
               </w:rPr>
-              <w:t>6,-52/ 56-!:2,-</w:t>
-            </w:r>
-            <w:r>
-              <w:rPr>
-                <w:rFonts w:ascii="Calibri" w:eastAsia="Times New Roman" w:hAnsi="Calibri" w:cs="Calibri"/>
-                <w:color w:val="000000"/>
-                <w:kern w:val="0"/>
-                <w14:ligatures w14:val="none"/>
-              </w:rPr>
-              <w:t>o</w:t>
+              <w:t>4;=o6'</w:t>
             </w:r>
           </w:p>
         </w:tc>
@@ -16310,7 +15965,7 @@
                 <w:kern w:val="0"/>
                 <w14:ligatures w14:val="none"/>
               </w:rPr>
-              <w:t>STUDY</w:t>
+              <w:t>INTERNET</w:t>
             </w:r>
           </w:p>
         </w:tc>
@@ -16343,7 +15998,7 @@
                 <w:kern w:val="0"/>
                 <w14:ligatures w14:val="none"/>
               </w:rPr>
-              <w:t>B2=@w</w:t>
+              <w:t>W/=W7;| @s</w:t>
             </w:r>
             <w:proofErr w:type="gramStart"/>
             <w:r>
@@ -16353,7 +16008,7 @@
                 <w:kern w:val="0"/>
                 <w14:ligatures w14:val="none"/>
               </w:rPr>
-              <w:t>5;-</w:t>
+              <w:t>3..</w:t>
             </w:r>
             <w:proofErr w:type="gramEnd"/>
             <w:r>
@@ -16363,7 +16018,7 @@
                 <w:kern w:val="0"/>
                 <w14:ligatures w14:val="none"/>
               </w:rPr>
-              <w:t>55/'</w:t>
+              <w:t xml:space="preserve"> @o.</w:t>
             </w:r>
           </w:p>
         </w:tc>
@@ -16402,7 +16057,7 @@
                 <w:kern w:val="0"/>
                 <w14:ligatures w14:val="none"/>
               </w:rPr>
-              <w:t>SUPPORT</w:t>
+              <w:t>KNOW</w:t>
             </w:r>
           </w:p>
         </w:tc>
@@ -16435,7 +16090,7 @@
                 <w:kern w:val="0"/>
                 <w14:ligatures w14:val="none"/>
               </w:rPr>
-              <w:t>s'</w:t>
+              <w:t>@.</w:t>
             </w:r>
             <w:proofErr w:type="gramStart"/>
             <w:r>
@@ -16445,7 +16100,7 @@
                 <w:kern w:val="0"/>
                 <w14:ligatures w14:val="none"/>
               </w:rPr>
-              <w:t>=!t</w:t>
+              <w:t>2;=</w:t>
             </w:r>
             <w:proofErr w:type="gramEnd"/>
             <w:r>
@@ -16455,7 +16110,7 @@
                 <w:kern w:val="0"/>
                 <w14:ligatures w14:val="none"/>
               </w:rPr>
-              <w:t>7=s/</w:t>
+              <w:t>}~=C</w:t>
             </w:r>
           </w:p>
         </w:tc>
@@ -16494,7 +16149,7 @@
                 <w:kern w:val="0"/>
                 <w14:ligatures w14:val="none"/>
               </w:rPr>
-              <w:t>THANK-YOU</w:t>
+              <w:t>LATER</w:t>
             </w:r>
           </w:p>
         </w:tc>
@@ -16520,6 +16175,80 @@
                 <w14:ligatures w14:val="none"/>
               </w:rPr>
             </w:pPr>
+          </w:p>
+        </w:tc>
+      </w:tr>
+      <w:tr>
+        <w:trPr>
+          <w:trHeight w:val="300"/>
+        </w:trPr>
+        <w:tc>
+          <w:tcPr>
+            <w:tcW w:w="2600" w:type="dxa"/>
+            <w:tcBorders>
+              <w:top w:val="nil"/>
+              <w:left w:val="single" w:sz="8" w:space="0" w:color="auto"/>
+              <w:bottom w:val="single" w:sz="8" w:space="0" w:color="auto"/>
+              <w:right w:val="single" w:sz="8" w:space="0" w:color="auto"/>
+            </w:tcBorders>
+            <w:shd w:val="clear" w:color="auto" w:fill="auto"/>
+            <w:noWrap/>
+            <w:vAlign w:val="center"/>
+            <w:hideMark/>
+          </w:tcPr>
+          <w:p>
+            <w:pPr>
+              <w:spacing w:after="0" w:line="240" w:lineRule="auto"/>
+              <w:rPr>
+                <w:rFonts w:ascii="Calibri" w:eastAsia="Times New Roman" w:hAnsi="Calibri" w:cs="Calibri"/>
+                <w:color w:val="000000"/>
+                <w:kern w:val="0"/>
+                <w14:ligatures w14:val="none"/>
+              </w:rPr>
+            </w:pPr>
+            <w:r>
+              <w:rPr>
+                <w:rFonts w:ascii="Calibri" w:eastAsia="Times New Roman" w:hAnsi="Calibri" w:cs="Calibri"/>
+                <w:color w:val="000000"/>
+                <w:kern w:val="0"/>
+                <w14:ligatures w14:val="none"/>
+              </w:rPr>
+              <w:t xml:space="preserve">LIVE </w:t>
+            </w:r>
+          </w:p>
+        </w:tc>
+        <w:tc>
+          <w:tcPr>
+            <w:tcW w:w="5850" w:type="dxa"/>
+            <w:tcBorders>
+              <w:top w:val="nil"/>
+              <w:left w:val="nil"/>
+              <w:bottom w:val="single" w:sz="8" w:space="0" w:color="auto"/>
+              <w:right w:val="single" w:sz="8" w:space="0" w:color="auto"/>
+            </w:tcBorders>
+            <w:shd w:val="clear" w:color="auto" w:fill="auto"/>
+            <w:vAlign w:val="center"/>
+            <w:hideMark/>
+          </w:tcPr>
+          <w:p>
+            <w:pPr>
+              <w:spacing w:after="0" w:line="240" w:lineRule="auto"/>
+              <w:rPr>
+                <w:rFonts w:ascii="Calibri" w:eastAsia="Times New Roman" w:hAnsi="Calibri" w:cs="Calibri"/>
+                <w:color w:val="000000"/>
+                <w:kern w:val="0"/>
+                <w14:ligatures w14:val="none"/>
+              </w:rPr>
+            </w:pPr>
+            <w:r>
+              <w:rPr>
+                <w:rFonts w:ascii="Calibri" w:eastAsia="Times New Roman" w:hAnsi="Calibri" w:cs="Calibri"/>
+                <w:color w:val="000000"/>
+                <w:kern w:val="0"/>
+                <w14:ligatures w14:val="none"/>
+              </w:rPr>
+              <w:t>['| A6/</w:t>
+            </w:r>
             <w:proofErr w:type="gramStart"/>
             <w:r>
               <w:rPr>
@@ -16528,6 +16257,183 @@
                 <w:kern w:val="0"/>
                 <w14:ligatures w14:val="none"/>
               </w:rPr>
+              <w:t>= !</w:t>
+            </w:r>
+            <w:proofErr w:type="gramEnd"/>
+            <w:r>
+              <w:rPr>
+                <w:rFonts w:ascii="Calibri" w:eastAsia="Times New Roman" w:hAnsi="Calibri" w:cs="Calibri"/>
+                <w:color w:val="000000"/>
+                <w:kern w:val="0"/>
+                <w14:ligatures w14:val="none"/>
+              </w:rPr>
+              <w:t>= A2</w:t>
+            </w:r>
+          </w:p>
+        </w:tc>
+      </w:tr>
+      <w:tr>
+        <w:trPr>
+          <w:trHeight w:val="300"/>
+        </w:trPr>
+        <w:tc>
+          <w:tcPr>
+            <w:tcW w:w="2600" w:type="dxa"/>
+            <w:tcBorders>
+              <w:top w:val="nil"/>
+              <w:left w:val="single" w:sz="8" w:space="0" w:color="auto"/>
+              <w:bottom w:val="single" w:sz="8" w:space="0" w:color="auto"/>
+              <w:right w:val="single" w:sz="8" w:space="0" w:color="auto"/>
+            </w:tcBorders>
+            <w:shd w:val="clear" w:color="auto" w:fill="auto"/>
+            <w:noWrap/>
+            <w:vAlign w:val="center"/>
+          </w:tcPr>
+          <w:p>
+            <w:pPr>
+              <w:spacing w:after="0" w:line="240" w:lineRule="auto"/>
+              <w:rPr>
+                <w:rFonts w:ascii="Calibri" w:eastAsia="Times New Roman" w:hAnsi="Calibri" w:cs="Calibri"/>
+                <w:color w:val="000000"/>
+                <w:kern w:val="0"/>
+                <w14:ligatures w14:val="none"/>
+              </w:rPr>
+            </w:pPr>
+            <w:r>
+              <w:rPr>
+                <w:rFonts w:ascii="Calibri" w:eastAsia="Times New Roman" w:hAnsi="Calibri" w:cs="Calibri"/>
+                <w:color w:val="000000"/>
+                <w:kern w:val="0"/>
+                <w14:ligatures w14:val="none"/>
+              </w:rPr>
+              <w:t>MAKE</w:t>
+            </w:r>
+          </w:p>
+        </w:tc>
+        <w:tc>
+          <w:tcPr>
+            <w:tcW w:w="5850" w:type="dxa"/>
+            <w:tcBorders>
+              <w:top w:val="nil"/>
+              <w:left w:val="nil"/>
+              <w:bottom w:val="single" w:sz="8" w:space="0" w:color="auto"/>
+              <w:right w:val="single" w:sz="8" w:space="0" w:color="auto"/>
+            </w:tcBorders>
+            <w:shd w:val="clear" w:color="auto" w:fill="auto"/>
+            <w:vAlign w:val="center"/>
+          </w:tcPr>
+          <w:p>
+            <w:pPr>
+              <w:spacing w:after="0" w:line="240" w:lineRule="auto"/>
+              <w:rPr>
+                <w:rFonts w:ascii="Calibri" w:eastAsia="Times New Roman" w:hAnsi="Calibri" w:cs="Calibri"/>
+                <w:color w:val="000000"/>
+                <w:kern w:val="0"/>
+                <w14:ligatures w14:val="none"/>
+              </w:rPr>
+            </w:pPr>
+            <w:r>
+              <w:rPr>
+                <w:rFonts w:ascii="Calibri" w:eastAsia="Times New Roman" w:hAnsi="Calibri" w:cs="Calibri"/>
+                <w:color w:val="000000"/>
+                <w:kern w:val="0"/>
+                <w14:ligatures w14:val="none"/>
+              </w:rPr>
+              <w:t>s</w:t>
+            </w:r>
+            <w:proofErr w:type="gramStart"/>
+            <w:r>
+              <w:rPr>
+                <w:rFonts w:ascii="Calibri" w:eastAsia="Times New Roman" w:hAnsi="Calibri" w:cs="Calibri"/>
+                <w:color w:val="000000"/>
+                <w:kern w:val="0"/>
+                <w14:ligatures w14:val="none"/>
+              </w:rPr>
+              <w:t>2.|</w:t>
+            </w:r>
+            <w:proofErr w:type="gramEnd"/>
+            <w:r>
+              <w:rPr>
+                <w:rFonts w:ascii="Calibri" w:eastAsia="Times New Roman" w:hAnsi="Calibri" w:cs="Calibri"/>
+                <w:color w:val="000000"/>
+                <w:kern w:val="0"/>
+                <w14:ligatures w14:val="none"/>
+              </w:rPr>
+              <w:t xml:space="preserve"> :2;|s'6/=@c7;;</w:t>
+            </w:r>
+          </w:p>
+        </w:tc>
+      </w:tr>
+      <w:tr>
+        <w:trPr>
+          <w:trHeight w:val="300"/>
+        </w:trPr>
+        <w:tc>
+          <w:tcPr>
+            <w:tcW w:w="2600" w:type="dxa"/>
+            <w:tcBorders>
+              <w:top w:val="nil"/>
+              <w:left w:val="single" w:sz="8" w:space="0" w:color="auto"/>
+              <w:bottom w:val="single" w:sz="8" w:space="0" w:color="auto"/>
+              <w:right w:val="single" w:sz="8" w:space="0" w:color="auto"/>
+            </w:tcBorders>
+            <w:shd w:val="clear" w:color="auto" w:fill="auto"/>
+            <w:noWrap/>
+            <w:vAlign w:val="center"/>
+            <w:hideMark/>
+          </w:tcPr>
+          <w:p>
+            <w:pPr>
+              <w:spacing w:after="0" w:line="240" w:lineRule="auto"/>
+              <w:rPr>
+                <w:rFonts w:ascii="Calibri" w:eastAsia="Times New Roman" w:hAnsi="Calibri" w:cs="Calibri"/>
+                <w:color w:val="000000"/>
+                <w:kern w:val="0"/>
+                <w14:ligatures w14:val="none"/>
+              </w:rPr>
+            </w:pPr>
+            <w:r>
+              <w:rPr>
+                <w:rFonts w:ascii="Calibri" w:eastAsia="Times New Roman" w:hAnsi="Calibri" w:cs="Calibri"/>
+                <w:color w:val="000000"/>
+                <w:kern w:val="0"/>
+                <w14:ligatures w14:val="none"/>
+              </w:rPr>
+              <w:t xml:space="preserve">MAN </w:t>
+            </w:r>
+          </w:p>
+        </w:tc>
+        <w:tc>
+          <w:tcPr>
+            <w:tcW w:w="5850" w:type="dxa"/>
+            <w:tcBorders>
+              <w:top w:val="nil"/>
+              <w:left w:val="nil"/>
+              <w:bottom w:val="single" w:sz="8" w:space="0" w:color="auto"/>
+              <w:right w:val="single" w:sz="8" w:space="0" w:color="auto"/>
+            </w:tcBorders>
+            <w:shd w:val="clear" w:color="auto" w:fill="auto"/>
+            <w:vAlign w:val="center"/>
+            <w:hideMark/>
+          </w:tcPr>
+          <w:p>
+            <w:pPr>
+              <w:spacing w:after="0" w:line="240" w:lineRule="auto"/>
+              <w:rPr>
+                <w:rFonts w:ascii="Calibri" w:eastAsia="Times New Roman" w:hAnsi="Calibri" w:cs="Calibri"/>
+                <w:color w:val="000000"/>
+                <w:kern w:val="0"/>
+                <w14:ligatures w14:val="none"/>
+              </w:rPr>
+            </w:pPr>
+            <w:proofErr w:type="gramStart"/>
+            <w:r>
+              <w:rPr>
+                <w:rFonts w:ascii="Calibri" w:eastAsia="Times New Roman" w:hAnsi="Calibri" w:cs="Calibri"/>
+                <w:color w:val="000000"/>
+                <w:kern w:val="0"/>
+                <w14:ligatures w14:val="none"/>
+              </w:rPr>
               <w:t>}~</w:t>
             </w:r>
             <w:proofErr w:type="gramEnd"/>
@@ -16538,7 +16444,1991 @@
                 <w:kern w:val="0"/>
                 <w14:ligatures w14:val="none"/>
               </w:rPr>
+              <w:t>=5;;=!c4.</w:t>
+            </w:r>
+          </w:p>
+        </w:tc>
+      </w:tr>
+      <w:tr>
+        <w:trPr>
+          <w:trHeight w:val="300"/>
+        </w:trPr>
+        <w:tc>
+          <w:tcPr>
+            <w:tcW w:w="2600" w:type="dxa"/>
+            <w:tcBorders>
+              <w:top w:val="nil"/>
+              <w:left w:val="single" w:sz="8" w:space="0" w:color="auto"/>
+              <w:bottom w:val="single" w:sz="8" w:space="0" w:color="auto"/>
+              <w:right w:val="single" w:sz="8" w:space="0" w:color="auto"/>
+            </w:tcBorders>
+            <w:shd w:val="clear" w:color="auto" w:fill="auto"/>
+            <w:noWrap/>
+            <w:vAlign w:val="center"/>
+            <w:hideMark/>
+          </w:tcPr>
+          <w:p>
+            <w:pPr>
+              <w:spacing w:after="0" w:line="240" w:lineRule="auto"/>
+              <w:rPr>
+                <w:rFonts w:ascii="Calibri" w:eastAsia="Times New Roman" w:hAnsi="Calibri" w:cs="Calibri"/>
+                <w:color w:val="000000"/>
+                <w:kern w:val="0"/>
+                <w14:ligatures w14:val="none"/>
+              </w:rPr>
+            </w:pPr>
+            <w:r>
+              <w:rPr>
+                <w:rFonts w:ascii="Calibri" w:eastAsia="Times New Roman" w:hAnsi="Calibri" w:cs="Calibri"/>
+                <w:color w:val="000000"/>
+                <w:kern w:val="0"/>
+                <w14:ligatures w14:val="none"/>
+              </w:rPr>
+              <w:t xml:space="preserve">MEET </w:t>
+            </w:r>
+          </w:p>
+        </w:tc>
+        <w:tc>
+          <w:tcPr>
+            <w:tcW w:w="5850" w:type="dxa"/>
+            <w:tcBorders>
+              <w:top w:val="nil"/>
+              <w:left w:val="nil"/>
+              <w:bottom w:val="single" w:sz="8" w:space="0" w:color="auto"/>
+              <w:right w:val="single" w:sz="8" w:space="0" w:color="auto"/>
+            </w:tcBorders>
+            <w:shd w:val="clear" w:color="auto" w:fill="auto"/>
+            <w:vAlign w:val="center"/>
+            <w:hideMark/>
+          </w:tcPr>
+          <w:p>
+            <w:pPr>
+              <w:spacing w:after="0" w:line="240" w:lineRule="auto"/>
+              <w:rPr>
+                <w:rFonts w:ascii="Calibri" w:eastAsia="Times New Roman" w:hAnsi="Calibri" w:cs="Calibri"/>
+                <w:color w:val="000000"/>
+                <w:kern w:val="0"/>
+                <w14:ligatures w14:val="none"/>
+              </w:rPr>
+            </w:pPr>
+            <w:r>
+              <w:rPr>
+                <w:rFonts w:ascii="Calibri" w:eastAsia="Times New Roman" w:hAnsi="Calibri" w:cs="Calibri"/>
+                <w:color w:val="000000"/>
+                <w:kern w:val="0"/>
+                <w14:ligatures w14:val="none"/>
+              </w:rPr>
+              <w:t>1</w:t>
+            </w:r>
+            <w:proofErr w:type="gramStart"/>
+            <w:r>
+              <w:rPr>
+                <w:rFonts w:ascii="Calibri" w:eastAsia="Times New Roman" w:hAnsi="Calibri" w:cs="Calibri"/>
+                <w:color w:val="000000"/>
+                <w:kern w:val="0"/>
+                <w14:ligatures w14:val="none"/>
+              </w:rPr>
+              <w:t>|!,</w:t>
+            </w:r>
+            <w:proofErr w:type="gramEnd"/>
+            <w:r>
+              <w:rPr>
+                <w:rFonts w:ascii="Calibri" w:eastAsia="Times New Roman" w:hAnsi="Calibri" w:cs="Calibri"/>
+                <w:color w:val="000000"/>
+                <w:kern w:val="0"/>
+                <w14:ligatures w14:val="none"/>
+              </w:rPr>
+              <w:t>2=!/,6-1/</w:t>
+            </w:r>
+          </w:p>
+        </w:tc>
+      </w:tr>
+      <w:tr>
+        <w:trPr>
+          <w:trHeight w:val="300"/>
+        </w:trPr>
+        <w:tc>
+          <w:tcPr>
+            <w:tcW w:w="2600" w:type="dxa"/>
+            <w:tcBorders>
+              <w:top w:val="nil"/>
+              <w:left w:val="single" w:sz="8" w:space="0" w:color="auto"/>
+              <w:bottom w:val="single" w:sz="8" w:space="0" w:color="auto"/>
+              <w:right w:val="single" w:sz="8" w:space="0" w:color="auto"/>
+            </w:tcBorders>
+            <w:shd w:val="clear" w:color="auto" w:fill="auto"/>
+            <w:noWrap/>
+            <w:vAlign w:val="center"/>
+            <w:hideMark/>
+          </w:tcPr>
+          <w:p>
+            <w:pPr>
+              <w:spacing w:after="0" w:line="240" w:lineRule="auto"/>
+              <w:rPr>
+                <w:rFonts w:ascii="Calibri" w:eastAsia="Times New Roman" w:hAnsi="Calibri" w:cs="Calibri"/>
+                <w:color w:val="000000"/>
+                <w:kern w:val="0"/>
+                <w14:ligatures w14:val="none"/>
+              </w:rPr>
+            </w:pPr>
+            <w:r>
+              <w:rPr>
+                <w:rFonts w:ascii="Calibri" w:eastAsia="Times New Roman" w:hAnsi="Calibri" w:cs="Calibri"/>
+                <w:color w:val="000000"/>
+                <w:kern w:val="0"/>
+                <w14:ligatures w14:val="none"/>
+              </w:rPr>
+              <w:t xml:space="preserve">MY/MINE </w:t>
+            </w:r>
+          </w:p>
+        </w:tc>
+        <w:tc>
+          <w:tcPr>
+            <w:tcW w:w="5850" w:type="dxa"/>
+            <w:tcBorders>
+              <w:top w:val="nil"/>
+              <w:left w:val="nil"/>
+              <w:bottom w:val="single" w:sz="8" w:space="0" w:color="auto"/>
+              <w:right w:val="single" w:sz="8" w:space="0" w:color="auto"/>
+            </w:tcBorders>
+            <w:shd w:val="clear" w:color="auto" w:fill="auto"/>
+            <w:vAlign w:val="center"/>
+            <w:hideMark/>
+          </w:tcPr>
+          <w:p>
+            <w:pPr>
+              <w:spacing w:after="0" w:line="240" w:lineRule="auto"/>
+              <w:rPr>
+                <w:rFonts w:ascii="Calibri" w:eastAsia="Times New Roman" w:hAnsi="Calibri" w:cs="Calibri"/>
+                <w:color w:val="000000"/>
+                <w:kern w:val="0"/>
+                <w14:ligatures w14:val="none"/>
+              </w:rPr>
+            </w:pPr>
+            <w:r>
+              <w:rPr>
+                <w:rFonts w:ascii="Calibri" w:eastAsia="Times New Roman" w:hAnsi="Calibri" w:cs="Calibri"/>
+                <w:color w:val="000000"/>
+                <w:kern w:val="0"/>
+                <w14:ligatures w14:val="none"/>
+              </w:rPr>
+              <w:t>[;|_B/6-.</w:t>
+            </w:r>
+          </w:p>
+        </w:tc>
+      </w:tr>
+      <w:tr>
+        <w:trPr>
+          <w:trHeight w:val="300"/>
+        </w:trPr>
+        <w:tc>
+          <w:tcPr>
+            <w:tcW w:w="2600" w:type="dxa"/>
+            <w:tcBorders>
+              <w:top w:val="nil"/>
+              <w:left w:val="single" w:sz="8" w:space="0" w:color="auto"/>
+              <w:bottom w:val="single" w:sz="8" w:space="0" w:color="auto"/>
+              <w:right w:val="single" w:sz="8" w:space="0" w:color="auto"/>
+            </w:tcBorders>
+            <w:shd w:val="clear" w:color="auto" w:fill="auto"/>
+            <w:noWrap/>
+            <w:vAlign w:val="center"/>
+          </w:tcPr>
+          <w:p>
+            <w:pPr>
+              <w:spacing w:after="0" w:line="240" w:lineRule="auto"/>
+              <w:rPr>
+                <w:rFonts w:ascii="Calibri" w:eastAsia="Times New Roman" w:hAnsi="Calibri" w:cs="Calibri"/>
+                <w:color w:val="000000"/>
+                <w:kern w:val="0"/>
+                <w14:ligatures w14:val="none"/>
+              </w:rPr>
+            </w:pPr>
+            <w:r>
+              <w:rPr>
+                <w:rFonts w:ascii="Calibri" w:eastAsia="Times New Roman" w:hAnsi="Calibri" w:cs="Calibri"/>
+                <w:color w:val="000000"/>
+                <w:kern w:val="0"/>
+                <w14:ligatures w14:val="none"/>
+              </w:rPr>
+              <w:t>NAME</w:t>
+            </w:r>
+          </w:p>
+        </w:tc>
+        <w:tc>
+          <w:tcPr>
+            <w:tcW w:w="5850" w:type="dxa"/>
+            <w:tcBorders>
+              <w:top w:val="nil"/>
+              <w:left w:val="nil"/>
+              <w:bottom w:val="single" w:sz="8" w:space="0" w:color="auto"/>
+              <w:right w:val="single" w:sz="8" w:space="0" w:color="auto"/>
+            </w:tcBorders>
+            <w:shd w:val="clear" w:color="auto" w:fill="auto"/>
+            <w:vAlign w:val="center"/>
+          </w:tcPr>
+          <w:p>
+            <w:pPr>
+              <w:spacing w:after="0" w:line="240" w:lineRule="auto"/>
+              <w:rPr>
+                <w:rFonts w:ascii="Calibri" w:eastAsia="Times New Roman" w:hAnsi="Calibri" w:cs="Calibri"/>
+                <w:color w:val="000000"/>
+                <w:kern w:val="0"/>
+                <w14:ligatures w14:val="none"/>
+              </w:rPr>
+            </w:pPr>
+            <w:r>
+              <w:rPr>
+                <w:rFonts w:ascii="Calibri" w:eastAsia="Times New Roman" w:hAnsi="Calibri" w:cs="Calibri"/>
+                <w:color w:val="000000"/>
+                <w:kern w:val="0"/>
+                <w14:ligatures w14:val="none"/>
+              </w:rPr>
+              <w:t>h</w:t>
+            </w:r>
+            <w:r>
+              <w:rPr>
+                <w:rFonts w:ascii="Calibri" w:eastAsia="Times New Roman" w:hAnsi="Calibri" w:cs="Calibri"/>
+                <w:color w:val="000000"/>
+                <w:kern w:val="0"/>
+                <w14:ligatures w14:val="none"/>
+              </w:rPr>
+              <w:t>/</w:t>
+            </w:r>
+            <w:proofErr w:type="gramStart"/>
+            <w:r>
+              <w:rPr>
+                <w:rFonts w:ascii="Calibri" w:eastAsia="Times New Roman" w:hAnsi="Calibri" w:cs="Calibri"/>
+                <w:color w:val="000000"/>
+                <w:kern w:val="0"/>
+                <w14:ligatures w14:val="none"/>
+              </w:rPr>
+              <w:t>-:2;;</w:t>
+            </w:r>
+            <w:proofErr w:type="gramEnd"/>
+            <w:r>
+              <w:rPr>
+                <w:rFonts w:ascii="Calibri" w:eastAsia="Times New Roman" w:hAnsi="Calibri" w:cs="Calibri"/>
+                <w:color w:val="000000"/>
+                <w:kern w:val="0"/>
+                <w14:ligatures w14:val="none"/>
+              </w:rPr>
+              <w:t>-</w:t>
+            </w:r>
+            <w:r>
+              <w:rPr>
+                <w:rFonts w:ascii="Calibri" w:eastAsia="Times New Roman" w:hAnsi="Calibri" w:cs="Calibri"/>
+                <w:color w:val="000000"/>
+                <w:kern w:val="0"/>
+                <w14:ligatures w14:val="none"/>
+              </w:rPr>
+              <w:t>h</w:t>
+            </w:r>
+            <w:r>
+              <w:rPr>
+                <w:rFonts w:ascii="Calibri" w:eastAsia="Times New Roman" w:hAnsi="Calibri" w:cs="Calibri"/>
+                <w:color w:val="000000"/>
+                <w:kern w:val="0"/>
+                <w14:ligatures w14:val="none"/>
+              </w:rPr>
+              <w:t>'</w:t>
+            </w:r>
+          </w:p>
+        </w:tc>
+      </w:tr>
+      <w:tr>
+        <w:trPr>
+          <w:trHeight w:val="300"/>
+        </w:trPr>
+        <w:tc>
+          <w:tcPr>
+            <w:tcW w:w="2600" w:type="dxa"/>
+            <w:tcBorders>
+              <w:top w:val="nil"/>
+              <w:left w:val="single" w:sz="8" w:space="0" w:color="auto"/>
+              <w:bottom w:val="single" w:sz="8" w:space="0" w:color="auto"/>
+              <w:right w:val="single" w:sz="8" w:space="0" w:color="auto"/>
+            </w:tcBorders>
+            <w:shd w:val="clear" w:color="auto" w:fill="auto"/>
+            <w:noWrap/>
+            <w:vAlign w:val="center"/>
+          </w:tcPr>
+          <w:p>
+            <w:pPr>
+              <w:spacing w:after="0" w:line="240" w:lineRule="auto"/>
+              <w:rPr>
+                <w:rFonts w:ascii="Calibri" w:eastAsia="Times New Roman" w:hAnsi="Calibri" w:cs="Calibri"/>
+                <w:color w:val="000000"/>
+                <w:kern w:val="0"/>
+                <w14:ligatures w14:val="none"/>
+              </w:rPr>
+            </w:pPr>
+            <w:r>
+              <w:rPr>
+                <w:rFonts w:ascii="Calibri" w:eastAsia="Times New Roman" w:hAnsi="Calibri" w:cs="Calibri"/>
+                <w:color w:val="000000"/>
+                <w:kern w:val="0"/>
+                <w14:ligatures w14:val="none"/>
+              </w:rPr>
+              <w:t>NOD-HEAD-YES</w:t>
+            </w:r>
+          </w:p>
+        </w:tc>
+        <w:tc>
+          <w:tcPr>
+            <w:tcW w:w="5850" w:type="dxa"/>
+            <w:tcBorders>
+              <w:top w:val="nil"/>
+              <w:left w:val="nil"/>
+              <w:bottom w:val="single" w:sz="8" w:space="0" w:color="auto"/>
+              <w:right w:val="single" w:sz="8" w:space="0" w:color="auto"/>
+            </w:tcBorders>
+            <w:shd w:val="clear" w:color="auto" w:fill="auto"/>
+            <w:vAlign w:val="center"/>
+          </w:tcPr>
+          <w:p>
+            <w:pPr>
+              <w:spacing w:after="0" w:line="240" w:lineRule="auto"/>
+              <w:rPr>
+                <w:rFonts w:ascii="Calibri" w:eastAsia="Times New Roman" w:hAnsi="Calibri" w:cs="Calibri"/>
+                <w:color w:val="000000"/>
+                <w:kern w:val="0"/>
+                <w14:ligatures w14:val="none"/>
+              </w:rPr>
+            </w:pPr>
+            <w:proofErr w:type="gramStart"/>
+            <w:r>
+              <w:rPr>
+                <w:rFonts w:ascii="Calibri" w:eastAsia="Times New Roman" w:hAnsi="Calibri" w:cs="Calibri"/>
+                <w:color w:val="000000"/>
+                <w:kern w:val="0"/>
+                <w14:ligatures w14:val="none"/>
+              </w:rPr>
+              <w:t>}~</w:t>
+            </w:r>
+            <w:proofErr w:type="gramEnd"/>
+            <w:r>
+              <w:rPr>
+                <w:rFonts w:ascii="Calibri" w:eastAsia="Times New Roman" w:hAnsi="Calibri" w:cs="Calibri"/>
+                <w:color w:val="000000"/>
+                <w:kern w:val="0"/>
+                <w14:ligatures w14:val="none"/>
+              </w:rPr>
+              <w:t>|!r4/</w:t>
+            </w:r>
+          </w:p>
+        </w:tc>
+      </w:tr>
+      <w:tr>
+        <w:trPr>
+          <w:trHeight w:val="300"/>
+        </w:trPr>
+        <w:tc>
+          <w:tcPr>
+            <w:tcW w:w="2600" w:type="dxa"/>
+            <w:tcBorders>
+              <w:top w:val="nil"/>
+              <w:left w:val="single" w:sz="8" w:space="0" w:color="auto"/>
+              <w:bottom w:val="single" w:sz="8" w:space="0" w:color="auto"/>
+              <w:right w:val="single" w:sz="8" w:space="0" w:color="auto"/>
+            </w:tcBorders>
+            <w:shd w:val="clear" w:color="auto" w:fill="auto"/>
+            <w:noWrap/>
+            <w:vAlign w:val="center"/>
+          </w:tcPr>
+          <w:p>
+            <w:pPr>
+              <w:spacing w:after="0" w:line="240" w:lineRule="auto"/>
+              <w:rPr>
+                <w:rFonts w:ascii="Calibri" w:eastAsia="Times New Roman" w:hAnsi="Calibri" w:cs="Calibri"/>
+                <w:color w:val="000000"/>
+                <w:kern w:val="0"/>
+                <w14:ligatures w14:val="none"/>
+              </w:rPr>
+            </w:pPr>
+            <w:r>
+              <w:rPr>
+                <w:rFonts w:ascii="Calibri" w:eastAsia="Times New Roman" w:hAnsi="Calibri" w:cs="Calibri"/>
+                <w:color w:val="000000"/>
+                <w:kern w:val="0"/>
+                <w14:ligatures w14:val="none"/>
+              </w:rPr>
+              <w:t>NOT</w:t>
+            </w:r>
+          </w:p>
+        </w:tc>
+        <w:tc>
+          <w:tcPr>
+            <w:tcW w:w="5850" w:type="dxa"/>
+            <w:tcBorders>
+              <w:top w:val="nil"/>
+              <w:left w:val="nil"/>
+              <w:bottom w:val="single" w:sz="8" w:space="0" w:color="auto"/>
+              <w:right w:val="single" w:sz="8" w:space="0" w:color="auto"/>
+            </w:tcBorders>
+            <w:shd w:val="clear" w:color="auto" w:fill="auto"/>
+            <w:vAlign w:val="center"/>
+          </w:tcPr>
+          <w:p>
+            <w:pPr>
+              <w:spacing w:after="0" w:line="240" w:lineRule="auto"/>
+              <w:rPr>
+                <w:rFonts w:ascii="Calibri" w:eastAsia="Times New Roman" w:hAnsi="Calibri" w:cs="Calibri"/>
+                <w:color w:val="000000"/>
+                <w:kern w:val="0"/>
+                <w14:ligatures w14:val="none"/>
+              </w:rPr>
+            </w:pPr>
+            <w:proofErr w:type="gramStart"/>
+            <w:r>
+              <w:rPr>
+                <w:rFonts w:ascii="Calibri" w:eastAsia="Times New Roman" w:hAnsi="Calibri" w:cs="Calibri"/>
+                <w:color w:val="000000"/>
+                <w:kern w:val="0"/>
+                <w14:ligatures w14:val="none"/>
+              </w:rPr>
+              <w:t>}~</w:t>
+            </w:r>
+            <w:proofErr w:type="gramEnd"/>
+            <w:r>
+              <w:rPr>
+                <w:rFonts w:ascii="Calibri" w:eastAsia="Times New Roman" w:hAnsi="Calibri" w:cs="Calibri"/>
+                <w:color w:val="000000"/>
+                <w:kern w:val="0"/>
+                <w14:ligatures w14:val="none"/>
+              </w:rPr>
+              <w:t>/4-!2,| A.</w:t>
+            </w:r>
+          </w:p>
+        </w:tc>
+      </w:tr>
+      <w:tr>
+        <w:trPr>
+          <w:trHeight w:val="300"/>
+        </w:trPr>
+        <w:tc>
+          <w:tcPr>
+            <w:tcW w:w="2600" w:type="dxa"/>
+            <w:tcBorders>
+              <w:top w:val="nil"/>
+              <w:left w:val="single" w:sz="8" w:space="0" w:color="auto"/>
+              <w:bottom w:val="single" w:sz="8" w:space="0" w:color="auto"/>
+              <w:right w:val="single" w:sz="8" w:space="0" w:color="auto"/>
+            </w:tcBorders>
+            <w:shd w:val="clear" w:color="auto" w:fill="auto"/>
+            <w:noWrap/>
+            <w:vAlign w:val="center"/>
+            <w:hideMark/>
+          </w:tcPr>
+          <w:p>
+            <w:pPr>
+              <w:spacing w:after="0" w:line="240" w:lineRule="auto"/>
+              <w:rPr>
+                <w:rFonts w:ascii="Calibri" w:eastAsia="Times New Roman" w:hAnsi="Calibri" w:cs="Calibri"/>
+                <w:color w:val="000000"/>
+                <w:kern w:val="0"/>
+                <w14:ligatures w14:val="none"/>
+              </w:rPr>
+            </w:pPr>
+            <w:r>
+              <w:rPr>
+                <w:rFonts w:ascii="Calibri" w:eastAsia="Times New Roman" w:hAnsi="Calibri" w:cs="Calibri"/>
+                <w:color w:val="000000"/>
+                <w:kern w:val="0"/>
+                <w14:ligatures w14:val="none"/>
+              </w:rPr>
+              <w:t>PAH</w:t>
+            </w:r>
+          </w:p>
+        </w:tc>
+        <w:tc>
+          <w:tcPr>
+            <w:tcW w:w="5850" w:type="dxa"/>
+            <w:tcBorders>
+              <w:top w:val="nil"/>
+              <w:left w:val="nil"/>
+              <w:bottom w:val="single" w:sz="8" w:space="0" w:color="auto"/>
+              <w:right w:val="single" w:sz="8" w:space="0" w:color="auto"/>
+            </w:tcBorders>
+            <w:shd w:val="clear" w:color="auto" w:fill="auto"/>
+            <w:vAlign w:val="center"/>
+            <w:hideMark/>
+          </w:tcPr>
+          <w:p>
+            <w:pPr>
+              <w:spacing w:after="0" w:line="240" w:lineRule="auto"/>
+              <w:rPr>
+                <w:rFonts w:ascii="Calibri" w:eastAsia="Times New Roman" w:hAnsi="Calibri" w:cs="Calibri"/>
+                <w:color w:val="000000"/>
+                <w:kern w:val="0"/>
+                <w14:ligatures w14:val="none"/>
+              </w:rPr>
+            </w:pPr>
+            <w:r>
+              <w:rPr>
+                <w:rFonts w:ascii="Calibri" w:eastAsia="Times New Roman" w:hAnsi="Calibri" w:cs="Calibri"/>
+                <w:color w:val="000000"/>
+                <w:kern w:val="0"/>
+                <w14:ligatures w14:val="none"/>
+              </w:rPr>
+              <w:t>#p=#</w:t>
+            </w:r>
+            <w:proofErr w:type="gramStart"/>
+            <w:r>
+              <w:rPr>
+                <w:rFonts w:ascii="Calibri" w:eastAsia="Times New Roman" w:hAnsi="Calibri" w:cs="Calibri"/>
+                <w:color w:val="000000"/>
+                <w:kern w:val="0"/>
+                <w14:ligatures w14:val="none"/>
+              </w:rPr>
+              <w:t>o !c</w:t>
+            </w:r>
+            <w:proofErr w:type="gramEnd"/>
+            <w:r>
+              <w:rPr>
+                <w:rFonts w:ascii="Calibri" w:eastAsia="Times New Roman" w:hAnsi="Calibri" w:cs="Calibri"/>
+                <w:color w:val="000000"/>
+                <w:kern w:val="0"/>
+                <w14:ligatures w14:val="none"/>
+              </w:rPr>
+              <w:t xml:space="preserve">/7'|1|@o,.  </w:t>
+            </w:r>
+            <w:proofErr w:type="gramStart"/>
+            <w:r>
+              <w:rPr>
+                <w:rFonts w:ascii="Calibri" w:eastAsia="Times New Roman" w:hAnsi="Calibri" w:cs="Calibri"/>
+                <w:color w:val="000000"/>
+                <w:kern w:val="0"/>
+                <w14:ligatures w14:val="none"/>
+              </w:rPr>
+              <w:t>!c</w:t>
+            </w:r>
+            <w:proofErr w:type="gramEnd"/>
+            <w:r>
+              <w:rPr>
+                <w:rFonts w:ascii="Calibri" w:eastAsia="Times New Roman" w:hAnsi="Calibri" w:cs="Calibri"/>
+                <w:color w:val="000000"/>
+                <w:kern w:val="0"/>
+                <w14:ligatures w14:val="none"/>
+              </w:rPr>
+              <w:t>1'-1/|@o,.</w:t>
+            </w:r>
+          </w:p>
+        </w:tc>
+      </w:tr>
+      <w:tr>
+        <w:trPr>
+          <w:trHeight w:val="300"/>
+        </w:trPr>
+        <w:tc>
+          <w:tcPr>
+            <w:tcW w:w="2600" w:type="dxa"/>
+            <w:tcBorders>
+              <w:top w:val="nil"/>
+              <w:left w:val="single" w:sz="8" w:space="0" w:color="auto"/>
+              <w:bottom w:val="single" w:sz="8" w:space="0" w:color="auto"/>
+              <w:right w:val="single" w:sz="8" w:space="0" w:color="auto"/>
+            </w:tcBorders>
+            <w:shd w:val="clear" w:color="auto" w:fill="auto"/>
+            <w:noWrap/>
+            <w:vAlign w:val="center"/>
+          </w:tcPr>
+          <w:p>
+            <w:pPr>
+              <w:spacing w:after="0" w:line="240" w:lineRule="auto"/>
+              <w:rPr>
+                <w:rFonts w:ascii="Calibri" w:eastAsia="Times New Roman" w:hAnsi="Calibri" w:cs="Calibri"/>
+                <w:color w:val="000000"/>
+                <w:kern w:val="0"/>
+                <w14:ligatures w14:val="none"/>
+              </w:rPr>
+            </w:pPr>
+            <w:r>
+              <w:rPr>
+                <w:rFonts w:ascii="Calibri" w:eastAsia="Times New Roman" w:hAnsi="Calibri" w:cs="Calibri"/>
+                <w:color w:val="000000"/>
+                <w:kern w:val="0"/>
+                <w14:ligatures w14:val="none"/>
+              </w:rPr>
+              <w:t>PLAN</w:t>
+            </w:r>
+          </w:p>
+        </w:tc>
+        <w:tc>
+          <w:tcPr>
+            <w:tcW w:w="5850" w:type="dxa"/>
+            <w:tcBorders>
+              <w:top w:val="nil"/>
+              <w:left w:val="nil"/>
+              <w:bottom w:val="single" w:sz="8" w:space="0" w:color="auto"/>
+              <w:right w:val="single" w:sz="8" w:space="0" w:color="auto"/>
+            </w:tcBorders>
+            <w:shd w:val="clear" w:color="auto" w:fill="auto"/>
+            <w:vAlign w:val="center"/>
+          </w:tcPr>
+          <w:p>
+            <w:pPr>
+              <w:spacing w:after="0" w:line="240" w:lineRule="auto"/>
+              <w:rPr>
+                <w:rFonts w:ascii="Calibri" w:eastAsia="Times New Roman" w:hAnsi="Calibri" w:cs="Calibri"/>
+                <w:color w:val="000000"/>
+                <w:kern w:val="0"/>
+                <w14:ligatures w14:val="none"/>
+              </w:rPr>
+            </w:pPr>
+            <w:r>
+              <w:rPr>
+                <w:rFonts w:ascii="Calibri" w:eastAsia="Times New Roman" w:hAnsi="Calibri" w:cs="Calibri"/>
+                <w:color w:val="000000"/>
+                <w:kern w:val="0"/>
+                <w14:ligatures w14:val="none"/>
+              </w:rPr>
+              <w:t>B|_@p2|!</w:t>
+            </w:r>
+            <w:proofErr w:type="gramStart"/>
+            <w:r>
+              <w:rPr>
+                <w:rFonts w:ascii="Calibri" w:eastAsia="Times New Roman" w:hAnsi="Calibri" w:cs="Calibri"/>
+                <w:color w:val="000000"/>
+                <w:kern w:val="0"/>
+                <w14:ligatures w14:val="none"/>
+              </w:rPr>
+              <w:t>2,-</w:t>
+            </w:r>
+            <w:proofErr w:type="gramEnd"/>
+            <w:r>
+              <w:rPr>
+                <w:rFonts w:ascii="Calibri" w:eastAsia="Times New Roman" w:hAnsi="Calibri" w:cs="Calibri"/>
+                <w:color w:val="000000"/>
+                <w:kern w:val="0"/>
+                <w14:ligatures w14:val="none"/>
+              </w:rPr>
+              <w:t>B|!:2,|_@p2</w:t>
+            </w:r>
+          </w:p>
+        </w:tc>
+      </w:tr>
+      <w:tr>
+        <w:trPr>
+          <w:trHeight w:val="300"/>
+        </w:trPr>
+        <w:tc>
+          <w:tcPr>
+            <w:tcW w:w="2600" w:type="dxa"/>
+            <w:tcBorders>
+              <w:top w:val="nil"/>
+              <w:left w:val="single" w:sz="8" w:space="0" w:color="auto"/>
+              <w:bottom w:val="single" w:sz="8" w:space="0" w:color="auto"/>
+              <w:right w:val="single" w:sz="8" w:space="0" w:color="auto"/>
+            </w:tcBorders>
+            <w:shd w:val="clear" w:color="auto" w:fill="auto"/>
+            <w:noWrap/>
+            <w:vAlign w:val="center"/>
+          </w:tcPr>
+          <w:p>
+            <w:pPr>
+              <w:spacing w:after="0" w:line="240" w:lineRule="auto"/>
+              <w:rPr>
+                <w:rFonts w:ascii="Calibri" w:eastAsia="Times New Roman" w:hAnsi="Calibri" w:cs="Calibri"/>
+                <w:color w:val="000000"/>
+                <w:kern w:val="0"/>
+                <w14:ligatures w14:val="none"/>
+              </w:rPr>
+            </w:pPr>
+            <w:r>
+              <w:rPr>
+                <w:rFonts w:ascii="Calibri" w:eastAsia="Times New Roman" w:hAnsi="Calibri" w:cs="Calibri"/>
+                <w:color w:val="000000"/>
+                <w:kern w:val="0"/>
+                <w14:ligatures w14:val="none"/>
+              </w:rPr>
+              <w:t xml:space="preserve">PROGRESS </w:t>
+            </w:r>
+          </w:p>
+        </w:tc>
+        <w:tc>
+          <w:tcPr>
+            <w:tcW w:w="5850" w:type="dxa"/>
+            <w:tcBorders>
+              <w:top w:val="nil"/>
+              <w:left w:val="nil"/>
+              <w:bottom w:val="single" w:sz="8" w:space="0" w:color="auto"/>
+              <w:right w:val="single" w:sz="8" w:space="0" w:color="auto"/>
+            </w:tcBorders>
+            <w:shd w:val="clear" w:color="auto" w:fill="auto"/>
+            <w:vAlign w:val="center"/>
+          </w:tcPr>
+          <w:p>
+            <w:pPr>
+              <w:spacing w:after="0" w:line="240" w:lineRule="auto"/>
+              <w:rPr>
+                <w:rFonts w:ascii="Calibri" w:eastAsia="Times New Roman" w:hAnsi="Calibri" w:cs="Calibri"/>
+                <w:color w:val="000000"/>
+                <w:kern w:val="0"/>
+                <w14:ligatures w14:val="none"/>
+              </w:rPr>
+            </w:pPr>
+            <w:r>
+              <w:rPr>
+                <w:rFonts w:ascii="Calibri" w:eastAsia="Times New Roman" w:hAnsi="Calibri" w:cs="Calibri"/>
+                <w:color w:val="000000"/>
+                <w:kern w:val="0"/>
+                <w14:ligatures w14:val="none"/>
+              </w:rPr>
+              <w:t>C</w:t>
+            </w:r>
+            <w:proofErr w:type="gramStart"/>
+            <w:r>
+              <w:rPr>
+                <w:rFonts w:ascii="Calibri" w:eastAsia="Times New Roman" w:hAnsi="Calibri" w:cs="Calibri"/>
+                <w:color w:val="000000"/>
+                <w:kern w:val="0"/>
+                <w14:ligatures w14:val="none"/>
+              </w:rPr>
+              <w:t>/.-</w:t>
+            </w:r>
+            <w:proofErr w:type="gramEnd"/>
+            <w:r>
+              <w:rPr>
+                <w:rFonts w:ascii="Calibri" w:eastAsia="Times New Roman" w:hAnsi="Calibri" w:cs="Calibri"/>
+                <w:color w:val="000000"/>
+                <w:kern w:val="0"/>
+                <w14:ligatures w14:val="none"/>
+              </w:rPr>
+              <w:t>@o;|C'</w:t>
+            </w:r>
+          </w:p>
+        </w:tc>
+      </w:tr>
+      <w:tr>
+        <w:trPr>
+          <w:trHeight w:val="300"/>
+        </w:trPr>
+        <w:tc>
+          <w:tcPr>
+            <w:tcW w:w="2600" w:type="dxa"/>
+            <w:tcBorders>
+              <w:top w:val="nil"/>
+              <w:left w:val="single" w:sz="8" w:space="0" w:color="auto"/>
+              <w:bottom w:val="single" w:sz="8" w:space="0" w:color="auto"/>
+              <w:right w:val="single" w:sz="8" w:space="0" w:color="auto"/>
+            </w:tcBorders>
+            <w:shd w:val="clear" w:color="auto" w:fill="auto"/>
+            <w:noWrap/>
+            <w:vAlign w:val="center"/>
+          </w:tcPr>
+          <w:p>
+            <w:pPr>
+              <w:spacing w:after="0" w:line="240" w:lineRule="auto"/>
+              <w:rPr>
+                <w:rFonts w:ascii="Calibri" w:eastAsia="Times New Roman" w:hAnsi="Calibri" w:cs="Calibri"/>
+                <w:color w:val="000000"/>
+                <w:kern w:val="0"/>
+                <w14:ligatures w14:val="none"/>
+              </w:rPr>
+            </w:pPr>
+            <w:r>
+              <w:rPr>
+                <w:rFonts w:ascii="Calibri" w:eastAsia="Times New Roman" w:hAnsi="Calibri" w:cs="Calibri"/>
+                <w:color w:val="000000"/>
+                <w:kern w:val="0"/>
+                <w14:ligatures w14:val="none"/>
+              </w:rPr>
+              <w:t>RED</w:t>
+            </w:r>
+          </w:p>
+        </w:tc>
+        <w:tc>
+          <w:tcPr>
+            <w:tcW w:w="5850" w:type="dxa"/>
+            <w:tcBorders>
+              <w:top w:val="nil"/>
+              <w:left w:val="nil"/>
+              <w:bottom w:val="single" w:sz="8" w:space="0" w:color="auto"/>
+              <w:right w:val="single" w:sz="8" w:space="0" w:color="auto"/>
+            </w:tcBorders>
+            <w:shd w:val="clear" w:color="auto" w:fill="auto"/>
+            <w:vAlign w:val="center"/>
+          </w:tcPr>
+          <w:p>
+            <w:pPr>
+              <w:spacing w:after="0" w:line="240" w:lineRule="auto"/>
+              <w:rPr>
+                <w:rFonts w:ascii="Calibri" w:eastAsia="Times New Roman" w:hAnsi="Calibri" w:cs="Calibri"/>
+                <w:color w:val="000000"/>
+                <w:kern w:val="0"/>
+                <w14:ligatures w14:val="none"/>
+              </w:rPr>
+            </w:pPr>
+            <w:proofErr w:type="gramStart"/>
+            <w:r>
+              <w:rPr>
+                <w:rFonts w:ascii="Calibri" w:eastAsia="Times New Roman" w:hAnsi="Calibri" w:cs="Calibri"/>
+                <w:color w:val="000000"/>
+                <w:kern w:val="0"/>
+                <w14:ligatures w14:val="none"/>
+              </w:rPr>
+              <w:t>}~</w:t>
+            </w:r>
+            <w:proofErr w:type="gramEnd"/>
+            <w:r>
+              <w:rPr>
+                <w:rFonts w:ascii="Calibri" w:eastAsia="Times New Roman" w:hAnsi="Calibri" w:cs="Calibri"/>
+                <w:color w:val="000000"/>
+                <w:kern w:val="0"/>
+                <w14:ligatures w14:val="none"/>
+              </w:rPr>
+              <w:t>4'/-@s5-</w:t>
+            </w:r>
+            <w:r>
+              <w:rPr>
+                <w:rFonts w:ascii="Calibri" w:eastAsia="Times New Roman" w:hAnsi="Calibri" w:cs="Calibri"/>
+                <w:color w:val="000000"/>
+                <w:kern w:val="0"/>
+                <w14:ligatures w14:val="none"/>
+              </w:rPr>
+              <w:t>x</w:t>
+            </w:r>
+            <w:r>
+              <w:rPr>
+                <w:rFonts w:ascii="Calibri" w:eastAsia="Times New Roman" w:hAnsi="Calibri" w:cs="Calibri"/>
+                <w:color w:val="000000"/>
+                <w:kern w:val="0"/>
+                <w14:ligatures w14:val="none"/>
+              </w:rPr>
+              <w:t>,</w:t>
+            </w:r>
+          </w:p>
+        </w:tc>
+      </w:tr>
+      <w:tr>
+        <w:trPr>
+          <w:trHeight w:val="300"/>
+        </w:trPr>
+        <w:tc>
+          <w:tcPr>
+            <w:tcW w:w="2600" w:type="dxa"/>
+            <w:tcBorders>
+              <w:top w:val="nil"/>
+              <w:left w:val="single" w:sz="8" w:space="0" w:color="auto"/>
+              <w:bottom w:val="single" w:sz="8" w:space="0" w:color="auto"/>
+              <w:right w:val="single" w:sz="8" w:space="0" w:color="auto"/>
+            </w:tcBorders>
+            <w:shd w:val="clear" w:color="auto" w:fill="auto"/>
+            <w:noWrap/>
+            <w:vAlign w:val="center"/>
+            <w:hideMark/>
+          </w:tcPr>
+          <w:p>
+            <w:pPr>
+              <w:spacing w:after="0" w:line="240" w:lineRule="auto"/>
+              <w:rPr>
+                <w:rFonts w:ascii="Calibri" w:eastAsia="Times New Roman" w:hAnsi="Calibri" w:cs="Calibri"/>
+                <w:color w:val="000000"/>
+                <w:kern w:val="0"/>
+                <w14:ligatures w14:val="none"/>
+              </w:rPr>
+            </w:pPr>
+            <w:r>
+              <w:rPr>
+                <w:rFonts w:ascii="Calibri" w:eastAsia="Times New Roman" w:hAnsi="Calibri" w:cs="Calibri"/>
+                <w:color w:val="000000"/>
+                <w:kern w:val="0"/>
+                <w14:ligatures w14:val="none"/>
+              </w:rPr>
+              <w:t xml:space="preserve">REMEMBER </w:t>
+            </w:r>
+          </w:p>
+        </w:tc>
+        <w:tc>
+          <w:tcPr>
+            <w:tcW w:w="5850" w:type="dxa"/>
+            <w:tcBorders>
+              <w:top w:val="nil"/>
+              <w:left w:val="nil"/>
+              <w:bottom w:val="single" w:sz="8" w:space="0" w:color="auto"/>
+              <w:right w:val="single" w:sz="8" w:space="0" w:color="auto"/>
+            </w:tcBorders>
+            <w:shd w:val="clear" w:color="auto" w:fill="auto"/>
+            <w:vAlign w:val="center"/>
+            <w:hideMark/>
+          </w:tcPr>
+          <w:p>
+            <w:pPr>
+              <w:spacing w:after="0" w:line="240" w:lineRule="auto"/>
+              <w:rPr>
+                <w:rFonts w:ascii="Calibri" w:eastAsia="Times New Roman" w:hAnsi="Calibri" w:cs="Calibri"/>
+                <w:color w:val="000000"/>
+                <w:kern w:val="0"/>
+                <w14:ligatures w14:val="none"/>
+              </w:rPr>
+            </w:pPr>
+            <w:r>
+              <w:rPr>
+                <w:rFonts w:ascii="Calibri" w:eastAsia="Times New Roman" w:hAnsi="Calibri" w:cs="Calibri"/>
+                <w:color w:val="000000"/>
+                <w:kern w:val="0"/>
+                <w14:ligatures w14:val="none"/>
+              </w:rPr>
+              <w:t>}-A'|!2</w:t>
+            </w:r>
+            <w:proofErr w:type="gramStart"/>
+            <w:r>
+              <w:rPr>
+                <w:rFonts w:ascii="Calibri" w:eastAsia="Times New Roman" w:hAnsi="Calibri" w:cs="Calibri"/>
+                <w:color w:val="000000"/>
+                <w:kern w:val="0"/>
+                <w14:ligatures w14:val="none"/>
+              </w:rPr>
+              <w:t>,.-</w:t>
+            </w:r>
+            <w:proofErr w:type="gramEnd"/>
+            <w:r>
+              <w:rPr>
+                <w:rFonts w:ascii="Calibri" w:eastAsia="Times New Roman" w:hAnsi="Calibri" w:cs="Calibri"/>
+                <w:color w:val="000000"/>
+                <w:kern w:val="0"/>
+                <w14:ligatures w14:val="none"/>
+              </w:rPr>
+              <w:t>!2,.-A7/- :;;2-A1  OR  }-A'|!2,.-A7/- :;;2-A1</w:t>
+            </w:r>
+          </w:p>
+        </w:tc>
+      </w:tr>
+      <w:tr>
+        <w:trPr>
+          <w:trHeight w:val="300"/>
+        </w:trPr>
+        <w:tc>
+          <w:tcPr>
+            <w:tcW w:w="2600" w:type="dxa"/>
+            <w:tcBorders>
+              <w:top w:val="nil"/>
+              <w:left w:val="single" w:sz="8" w:space="0" w:color="auto"/>
+              <w:bottom w:val="single" w:sz="8" w:space="0" w:color="auto"/>
+              <w:right w:val="single" w:sz="8" w:space="0" w:color="auto"/>
+            </w:tcBorders>
+            <w:shd w:val="clear" w:color="auto" w:fill="auto"/>
+            <w:noWrap/>
+            <w:vAlign w:val="center"/>
+          </w:tcPr>
+          <w:p>
+            <w:pPr>
+              <w:spacing w:after="0" w:line="240" w:lineRule="auto"/>
+              <w:rPr>
+                <w:rFonts w:ascii="Calibri" w:eastAsia="Times New Roman" w:hAnsi="Calibri" w:cs="Calibri"/>
+                <w:color w:val="000000"/>
+                <w:kern w:val="0"/>
+                <w14:ligatures w14:val="none"/>
+              </w:rPr>
+            </w:pPr>
+            <w:r>
+              <w:rPr>
+                <w:rFonts w:ascii="Calibri" w:eastAsia="Times New Roman" w:hAnsi="Calibri" w:cs="Calibri"/>
+                <w:color w:val="000000"/>
+                <w:kern w:val="0"/>
+                <w14:ligatures w14:val="none"/>
+              </w:rPr>
+              <w:t>RULES</w:t>
+            </w:r>
+          </w:p>
+        </w:tc>
+        <w:tc>
+          <w:tcPr>
+            <w:tcW w:w="5850" w:type="dxa"/>
+            <w:tcBorders>
+              <w:top w:val="nil"/>
+              <w:left w:val="nil"/>
+              <w:bottom w:val="single" w:sz="8" w:space="0" w:color="auto"/>
+              <w:right w:val="single" w:sz="8" w:space="0" w:color="auto"/>
+            </w:tcBorders>
+            <w:shd w:val="clear" w:color="auto" w:fill="auto"/>
+            <w:vAlign w:val="center"/>
+          </w:tcPr>
+          <w:p>
+            <w:pPr>
+              <w:spacing w:after="0" w:line="240" w:lineRule="auto"/>
+              <w:rPr>
+                <w:rFonts w:ascii="Calibri" w:eastAsia="Times New Roman" w:hAnsi="Calibri" w:cs="Calibri"/>
+                <w:color w:val="000000"/>
+                <w:kern w:val="0"/>
+                <w14:ligatures w14:val="none"/>
+              </w:rPr>
+            </w:pPr>
+            <w:r>
+              <w:rPr>
+                <w:rFonts w:ascii="Calibri" w:eastAsia="Times New Roman" w:hAnsi="Calibri" w:cs="Calibri"/>
+                <w:color w:val="000000"/>
+                <w:kern w:val="0"/>
+                <w14:ligatures w14:val="none"/>
+              </w:rPr>
+              <w:t>B-</w:t>
+            </w:r>
+            <w:proofErr w:type="gramStart"/>
+            <w:r>
+              <w:rPr>
+                <w:rFonts w:ascii="Calibri" w:eastAsia="Times New Roman" w:hAnsi="Calibri" w:cs="Calibri"/>
+                <w:color w:val="000000"/>
+                <w:kern w:val="0"/>
+                <w14:ligatures w14:val="none"/>
+              </w:rPr>
+              <w:t>:|:;;</w:t>
+            </w:r>
+            <w:proofErr w:type="gramEnd"/>
+            <w:r>
+              <w:rPr>
+                <w:rFonts w:ascii="Calibri" w:eastAsia="Times New Roman" w:hAnsi="Calibri" w:cs="Calibri"/>
+                <w:color w:val="000000"/>
+                <w:kern w:val="0"/>
+                <w14:ligatures w14:val="none"/>
+              </w:rPr>
+              <w:t xml:space="preserve"> C/;</w:t>
+            </w:r>
+          </w:p>
+        </w:tc>
+      </w:tr>
+      <w:tr>
+        <w:trPr>
+          <w:trHeight w:val="300"/>
+        </w:trPr>
+        <w:tc>
+          <w:tcPr>
+            <w:tcW w:w="2600" w:type="dxa"/>
+            <w:tcBorders>
+              <w:top w:val="nil"/>
+              <w:left w:val="single" w:sz="8" w:space="0" w:color="auto"/>
+              <w:bottom w:val="single" w:sz="8" w:space="0" w:color="auto"/>
+              <w:right w:val="single" w:sz="8" w:space="0" w:color="auto"/>
+            </w:tcBorders>
+            <w:shd w:val="clear" w:color="auto" w:fill="auto"/>
+            <w:noWrap/>
+            <w:vAlign w:val="center"/>
+          </w:tcPr>
+          <w:p>
+            <w:pPr>
+              <w:spacing w:after="0" w:line="240" w:lineRule="auto"/>
+              <w:rPr>
+                <w:rFonts w:ascii="Calibri" w:eastAsia="Times New Roman" w:hAnsi="Calibri" w:cs="Calibri"/>
+                <w:color w:val="000000"/>
+                <w:kern w:val="0"/>
+                <w14:ligatures w14:val="none"/>
+              </w:rPr>
+            </w:pPr>
+            <w:r>
+              <w:rPr>
+                <w:rFonts w:ascii="Calibri" w:eastAsia="Times New Roman" w:hAnsi="Calibri" w:cs="Calibri"/>
+                <w:color w:val="000000"/>
+                <w:kern w:val="0"/>
+                <w14:ligatures w14:val="none"/>
+              </w:rPr>
+              <w:t>RUN/OPERATE</w:t>
+            </w:r>
+          </w:p>
+        </w:tc>
+        <w:tc>
+          <w:tcPr>
+            <w:tcW w:w="5850" w:type="dxa"/>
+            <w:tcBorders>
+              <w:top w:val="nil"/>
+              <w:left w:val="nil"/>
+              <w:bottom w:val="single" w:sz="8" w:space="0" w:color="auto"/>
+              <w:right w:val="single" w:sz="8" w:space="0" w:color="auto"/>
+            </w:tcBorders>
+            <w:shd w:val="clear" w:color="auto" w:fill="auto"/>
+            <w:vAlign w:val="center"/>
+          </w:tcPr>
+          <w:p>
+            <w:pPr>
+              <w:spacing w:after="0" w:line="240" w:lineRule="auto"/>
+              <w:rPr>
+                <w:rFonts w:ascii="Calibri" w:eastAsia="Times New Roman" w:hAnsi="Calibri" w:cs="Calibri"/>
+                <w:color w:val="000000"/>
+                <w:kern w:val="0"/>
+                <w14:ligatures w14:val="none"/>
+              </w:rPr>
+            </w:pPr>
+            <w:r>
+              <w:rPr>
+                <w:rFonts w:ascii="Calibri" w:eastAsia="Times New Roman" w:hAnsi="Calibri" w:cs="Calibri"/>
+                <w:color w:val="000000"/>
+                <w:kern w:val="0"/>
+                <w14:ligatures w14:val="none"/>
+              </w:rPr>
+              <w:t>B/1</w:t>
+            </w:r>
+            <w:proofErr w:type="gramStart"/>
+            <w:r>
+              <w:rPr>
+                <w:rFonts w:ascii="Calibri" w:eastAsia="Times New Roman" w:hAnsi="Calibri" w:cs="Calibri"/>
+                <w:color w:val="000000"/>
+                <w:kern w:val="0"/>
+                <w14:ligatures w14:val="none"/>
+              </w:rPr>
+              <w:t>-!:</w:t>
+            </w:r>
+            <w:proofErr w:type="gramEnd"/>
+            <w:r>
+              <w:rPr>
+                <w:rFonts w:ascii="Calibri" w:eastAsia="Times New Roman" w:hAnsi="Calibri" w:cs="Calibri"/>
+                <w:color w:val="000000"/>
+                <w:kern w:val="0"/>
+                <w14:ligatures w14:val="none"/>
+              </w:rPr>
+              <w:t>1'-B7/</w:t>
+            </w:r>
+          </w:p>
+        </w:tc>
+      </w:tr>
+      <w:tr>
+        <w:trPr>
+          <w:trHeight w:val="300"/>
+        </w:trPr>
+        <w:tc>
+          <w:tcPr>
+            <w:tcW w:w="2600" w:type="dxa"/>
+            <w:tcBorders>
+              <w:top w:val="nil"/>
+              <w:left w:val="single" w:sz="8" w:space="0" w:color="auto"/>
+              <w:bottom w:val="single" w:sz="8" w:space="0" w:color="auto"/>
+              <w:right w:val="single" w:sz="8" w:space="0" w:color="auto"/>
+            </w:tcBorders>
+            <w:shd w:val="clear" w:color="auto" w:fill="auto"/>
+            <w:noWrap/>
+            <w:vAlign w:val="center"/>
+          </w:tcPr>
+          <w:p>
+            <w:pPr>
+              <w:spacing w:after="0" w:line="240" w:lineRule="auto"/>
+              <w:rPr>
+                <w:rFonts w:ascii="Calibri" w:eastAsia="Times New Roman" w:hAnsi="Calibri" w:cs="Calibri"/>
+                <w:color w:val="000000"/>
+                <w:kern w:val="0"/>
+                <w14:ligatures w14:val="none"/>
+              </w:rPr>
+            </w:pPr>
+            <w:r>
+              <w:rPr>
+                <w:rFonts w:ascii="Calibri" w:eastAsia="Times New Roman" w:hAnsi="Calibri" w:cs="Calibri"/>
+                <w:color w:val="000000"/>
+                <w:kern w:val="0"/>
+                <w14:ligatures w14:val="none"/>
+              </w:rPr>
+              <w:t>SAME</w:t>
+            </w:r>
+          </w:p>
+        </w:tc>
+        <w:tc>
+          <w:tcPr>
+            <w:tcW w:w="5850" w:type="dxa"/>
+            <w:tcBorders>
+              <w:top w:val="nil"/>
+              <w:left w:val="nil"/>
+              <w:bottom w:val="single" w:sz="8" w:space="0" w:color="auto"/>
+              <w:right w:val="single" w:sz="8" w:space="0" w:color="auto"/>
+            </w:tcBorders>
+            <w:shd w:val="clear" w:color="auto" w:fill="auto"/>
+            <w:vAlign w:val="center"/>
+          </w:tcPr>
+          <w:p>
+            <w:pPr>
+              <w:spacing w:after="0" w:line="240" w:lineRule="auto"/>
+              <w:rPr>
+                <w:rFonts w:ascii="Calibri" w:eastAsia="Times New Roman" w:hAnsi="Calibri" w:cs="Calibri"/>
+                <w:color w:val="000000"/>
+                <w:kern w:val="0"/>
+                <w14:ligatures w14:val="none"/>
+              </w:rPr>
+            </w:pPr>
+            <w:r>
+              <w:rPr>
+                <w:rFonts w:ascii="Calibri" w:eastAsia="Times New Roman" w:hAnsi="Calibri" w:cs="Calibri"/>
+                <w:color w:val="000000"/>
+                <w:kern w:val="0"/>
+                <w14:ligatures w14:val="none"/>
+              </w:rPr>
+              <w:t>y</w:t>
+            </w:r>
+            <w:proofErr w:type="gramStart"/>
+            <w:r>
+              <w:rPr>
+                <w:rFonts w:ascii="Calibri" w:eastAsia="Times New Roman" w:hAnsi="Calibri" w:cs="Calibri"/>
+                <w:color w:val="000000"/>
+                <w:kern w:val="0"/>
+                <w14:ligatures w14:val="none"/>
+              </w:rPr>
+              <w:t>|!r.</w:t>
+            </w:r>
+            <w:proofErr w:type="gramEnd"/>
+            <w:r>
+              <w:rPr>
+                <w:rFonts w:ascii="Calibri" w:eastAsia="Times New Roman" w:hAnsi="Calibri" w:cs="Calibri"/>
+                <w:color w:val="000000"/>
+                <w:kern w:val="0"/>
+                <w14:ligatures w14:val="none"/>
+              </w:rPr>
+              <w:t>.</w:t>
+            </w:r>
+          </w:p>
+        </w:tc>
+      </w:tr>
+      <w:tr>
+        <w:trPr>
+          <w:trHeight w:val="300"/>
+        </w:trPr>
+        <w:tc>
+          <w:tcPr>
+            <w:tcW w:w="2600" w:type="dxa"/>
+            <w:tcBorders>
+              <w:top w:val="nil"/>
+              <w:left w:val="single" w:sz="8" w:space="0" w:color="auto"/>
+              <w:bottom w:val="single" w:sz="8" w:space="0" w:color="auto"/>
+              <w:right w:val="single" w:sz="8" w:space="0" w:color="auto"/>
+            </w:tcBorders>
+            <w:shd w:val="clear" w:color="auto" w:fill="auto"/>
+            <w:noWrap/>
+            <w:vAlign w:val="center"/>
+          </w:tcPr>
+          <w:p>
+            <w:pPr>
+              <w:spacing w:after="0" w:line="240" w:lineRule="auto"/>
+              <w:rPr>
+                <w:rFonts w:ascii="Calibri" w:eastAsia="Times New Roman" w:hAnsi="Calibri" w:cs="Calibri"/>
+                <w:color w:val="000000"/>
+                <w:kern w:val="0"/>
+                <w14:ligatures w14:val="none"/>
+              </w:rPr>
+            </w:pPr>
+            <w:r>
+              <w:rPr>
+                <w:rFonts w:ascii="Calibri" w:eastAsia="Times New Roman" w:hAnsi="Calibri" w:cs="Calibri"/>
+                <w:color w:val="000000"/>
+                <w:kern w:val="0"/>
+                <w14:ligatures w14:val="none"/>
+              </w:rPr>
+              <w:t>SERIOUS</w:t>
+            </w:r>
+          </w:p>
+        </w:tc>
+        <w:tc>
+          <w:tcPr>
+            <w:tcW w:w="5850" w:type="dxa"/>
+            <w:tcBorders>
+              <w:top w:val="nil"/>
+              <w:left w:val="nil"/>
+              <w:bottom w:val="single" w:sz="8" w:space="0" w:color="auto"/>
+              <w:right w:val="single" w:sz="8" w:space="0" w:color="auto"/>
+            </w:tcBorders>
+            <w:shd w:val="clear" w:color="auto" w:fill="auto"/>
+            <w:vAlign w:val="center"/>
+          </w:tcPr>
+          <w:p>
+            <w:pPr>
+              <w:spacing w:after="0" w:line="240" w:lineRule="auto"/>
+              <w:rPr>
+                <w:rFonts w:ascii="Calibri" w:eastAsia="Times New Roman" w:hAnsi="Calibri" w:cs="Calibri"/>
+                <w:color w:val="000000"/>
+                <w:kern w:val="0"/>
+                <w14:ligatures w14:val="none"/>
+              </w:rPr>
+            </w:pPr>
+            <w:r>
+              <w:rPr>
+                <w:rFonts w:ascii="Calibri" w:eastAsia="Times New Roman" w:hAnsi="Calibri" w:cs="Calibri"/>
+                <w:color w:val="000000"/>
+                <w:kern w:val="0"/>
+                <w14:ligatures w14:val="none"/>
+              </w:rPr>
+              <w:t xml:space="preserve">[u4- </w:t>
+            </w:r>
+            <w:proofErr w:type="gramStart"/>
+            <w:r>
+              <w:rPr>
+                <w:rFonts w:ascii="Calibri" w:eastAsia="Times New Roman" w:hAnsi="Calibri" w:cs="Calibri"/>
+                <w:color w:val="000000"/>
+                <w:kern w:val="0"/>
+                <w14:ligatures w14:val="none"/>
+              </w:rPr>
+              <w:t>17.=</w:t>
+            </w:r>
+            <w:proofErr w:type="gramEnd"/>
+            <w:r>
+              <w:rPr>
+                <w:rFonts w:ascii="Calibri" w:eastAsia="Times New Roman" w:hAnsi="Calibri" w:cs="Calibri"/>
+                <w:color w:val="000000"/>
+                <w:kern w:val="0"/>
+                <w14:ligatures w14:val="none"/>
+              </w:rPr>
+              <w:t>@o,</w:t>
+            </w:r>
+          </w:p>
+        </w:tc>
+      </w:tr>
+      <w:tr>
+        <w:trPr>
+          <w:trHeight w:val="300"/>
+        </w:trPr>
+        <w:tc>
+          <w:tcPr>
+            <w:tcW w:w="2600" w:type="dxa"/>
+            <w:tcBorders>
+              <w:top w:val="nil"/>
+              <w:left w:val="single" w:sz="8" w:space="0" w:color="auto"/>
+              <w:bottom w:val="single" w:sz="8" w:space="0" w:color="auto"/>
+              <w:right w:val="single" w:sz="8" w:space="0" w:color="auto"/>
+            </w:tcBorders>
+            <w:shd w:val="clear" w:color="auto" w:fill="auto"/>
+            <w:noWrap/>
+            <w:vAlign w:val="center"/>
+          </w:tcPr>
+          <w:p>
+            <w:pPr>
+              <w:spacing w:after="0" w:line="240" w:lineRule="auto"/>
+              <w:rPr>
+                <w:rFonts w:ascii="Calibri" w:eastAsia="Times New Roman" w:hAnsi="Calibri" w:cs="Calibri"/>
+                <w:color w:val="000000"/>
+                <w:kern w:val="0"/>
+                <w14:ligatures w14:val="none"/>
+              </w:rPr>
+            </w:pPr>
+            <w:r>
+              <w:rPr>
+                <w:rFonts w:ascii="Calibri" w:eastAsia="Times New Roman" w:hAnsi="Calibri" w:cs="Calibri"/>
+                <w:color w:val="000000"/>
+                <w:kern w:val="0"/>
+                <w14:ligatures w14:val="none"/>
+              </w:rPr>
+              <w:t>SHAKE-HEAD-NO</w:t>
+            </w:r>
+          </w:p>
+        </w:tc>
+        <w:tc>
+          <w:tcPr>
+            <w:tcW w:w="5850" w:type="dxa"/>
+            <w:tcBorders>
+              <w:top w:val="nil"/>
+              <w:left w:val="nil"/>
+              <w:bottom w:val="single" w:sz="8" w:space="0" w:color="auto"/>
+              <w:right w:val="single" w:sz="8" w:space="0" w:color="auto"/>
+            </w:tcBorders>
+            <w:shd w:val="clear" w:color="auto" w:fill="auto"/>
+            <w:vAlign w:val="center"/>
+          </w:tcPr>
+          <w:p>
+            <w:pPr>
+              <w:spacing w:after="0" w:line="240" w:lineRule="auto"/>
+              <w:rPr>
+                <w:rFonts w:ascii="Calibri" w:eastAsia="Times New Roman" w:hAnsi="Calibri" w:cs="Calibri"/>
+                <w:color w:val="000000"/>
+                <w:kern w:val="0"/>
+                <w14:ligatures w14:val="none"/>
+              </w:rPr>
+            </w:pPr>
+            <w:r>
+              <w:rPr>
+                <w:rFonts w:ascii="Calibri" w:eastAsia="Times New Roman" w:hAnsi="Calibri" w:cs="Calibri"/>
+                <w:color w:val="000000"/>
+                <w:kern w:val="0"/>
+                <w14:ligatures w14:val="none"/>
+              </w:rPr>
+              <w:t>[u</w:t>
+            </w:r>
+            <w:proofErr w:type="gramStart"/>
+            <w:r>
+              <w:rPr>
+                <w:rFonts w:ascii="Calibri" w:eastAsia="Times New Roman" w:hAnsi="Calibri" w:cs="Calibri"/>
+                <w:color w:val="000000"/>
+                <w:kern w:val="0"/>
+                <w14:ligatures w14:val="none"/>
+              </w:rPr>
+              <w:t>| !</w:t>
+            </w:r>
+            <w:proofErr w:type="gramEnd"/>
+            <w:r>
+              <w:rPr>
+                <w:rFonts w:ascii="Calibri" w:eastAsia="Times New Roman" w:hAnsi="Calibri" w:cs="Calibri"/>
+                <w:color w:val="000000"/>
+                <w:kern w:val="0"/>
+                <w14:ligatures w14:val="none"/>
+              </w:rPr>
+              <w:t>r.</w:t>
+            </w:r>
+          </w:p>
+        </w:tc>
+      </w:tr>
+      <w:tr>
+        <w:trPr>
+          <w:trHeight w:val="300"/>
+        </w:trPr>
+        <w:tc>
+          <w:tcPr>
+            <w:tcW w:w="2600" w:type="dxa"/>
+            <w:tcBorders>
+              <w:top w:val="nil"/>
+              <w:left w:val="single" w:sz="8" w:space="0" w:color="auto"/>
+              <w:bottom w:val="single" w:sz="8" w:space="0" w:color="auto"/>
+              <w:right w:val="single" w:sz="8" w:space="0" w:color="auto"/>
+            </w:tcBorders>
+            <w:shd w:val="clear" w:color="auto" w:fill="auto"/>
+            <w:noWrap/>
+            <w:vAlign w:val="center"/>
+          </w:tcPr>
+          <w:p>
+            <w:pPr>
+              <w:spacing w:after="0" w:line="240" w:lineRule="auto"/>
+              <w:rPr>
+                <w:rFonts w:ascii="Calibri" w:eastAsia="Times New Roman" w:hAnsi="Calibri" w:cs="Calibri"/>
+                <w:color w:val="000000"/>
+                <w:kern w:val="0"/>
+                <w14:ligatures w14:val="none"/>
+              </w:rPr>
+            </w:pPr>
+            <w:r>
+              <w:rPr>
+                <w:rFonts w:ascii="Calibri" w:eastAsia="Times New Roman" w:hAnsi="Calibri" w:cs="Calibri"/>
+                <w:color w:val="000000"/>
+                <w:kern w:val="0"/>
+                <w14:ligatures w14:val="none"/>
+              </w:rPr>
+              <w:t>SPREAD</w:t>
+            </w:r>
+          </w:p>
+        </w:tc>
+        <w:tc>
+          <w:tcPr>
+            <w:tcW w:w="5850" w:type="dxa"/>
+            <w:tcBorders>
+              <w:top w:val="nil"/>
+              <w:left w:val="nil"/>
+              <w:bottom w:val="single" w:sz="8" w:space="0" w:color="auto"/>
+              <w:right w:val="single" w:sz="8" w:space="0" w:color="auto"/>
+            </w:tcBorders>
+            <w:shd w:val="clear" w:color="auto" w:fill="auto"/>
+            <w:vAlign w:val="center"/>
+          </w:tcPr>
+          <w:p>
+            <w:pPr>
+              <w:spacing w:after="0" w:line="240" w:lineRule="auto"/>
+              <w:rPr>
+                <w:rFonts w:ascii="Calibri" w:eastAsia="Times New Roman" w:hAnsi="Calibri" w:cs="Calibri"/>
+                <w:color w:val="000000"/>
+                <w:kern w:val="0"/>
+                <w14:ligatures w14:val="none"/>
+              </w:rPr>
+            </w:pPr>
+            <w:r>
+              <w:rPr>
+                <w:rFonts w:ascii="Calibri" w:eastAsia="Times New Roman" w:hAnsi="Calibri" w:cs="Calibri"/>
+                <w:color w:val="000000"/>
+                <w:kern w:val="0"/>
+                <w14:ligatures w14:val="none"/>
+              </w:rPr>
+              <w:t>!7-5/'-</w:t>
+            </w:r>
+            <w:r>
+              <w:rPr>
+                <w:rFonts w:ascii="Calibri" w:eastAsia="Times New Roman" w:hAnsi="Calibri" w:cs="Calibri"/>
+                <w:color w:val="000000"/>
+                <w:kern w:val="0"/>
+                <w14:ligatures w14:val="none"/>
+              </w:rPr>
+              <w:t>o</w:t>
+            </w:r>
+            <w:proofErr w:type="gramStart"/>
+            <w:r>
+              <w:rPr>
+                <w:rFonts w:ascii="Calibri" w:eastAsia="Times New Roman" w:hAnsi="Calibri" w:cs="Calibri"/>
+                <w:color w:val="000000"/>
+                <w:kern w:val="0"/>
+                <w14:ligatures w14:val="none"/>
+              </w:rPr>
+              <w:t>3.=</w:t>
+            </w:r>
+            <w:proofErr w:type="gramEnd"/>
+            <w:r>
+              <w:rPr>
+                <w:rFonts w:ascii="Calibri" w:eastAsia="Times New Roman" w:hAnsi="Calibri" w:cs="Calibri"/>
+                <w:color w:val="000000"/>
+                <w:kern w:val="0"/>
+                <w14:ligatures w14:val="none"/>
+              </w:rPr>
+              <w:t>o</w:t>
+            </w:r>
+            <w:r>
+              <w:rPr>
+                <w:rFonts w:ascii="Calibri" w:eastAsia="Times New Roman" w:hAnsi="Calibri" w:cs="Calibri"/>
+                <w:color w:val="000000"/>
+                <w:kern w:val="0"/>
+                <w14:ligatures w14:val="none"/>
+              </w:rPr>
+              <w:t>/5.-5'-!1</w:t>
+            </w:r>
+          </w:p>
+        </w:tc>
+      </w:tr>
+      <w:tr>
+        <w:trPr>
+          <w:trHeight w:val="300"/>
+        </w:trPr>
+        <w:tc>
+          <w:tcPr>
+            <w:tcW w:w="2600" w:type="dxa"/>
+            <w:tcBorders>
+              <w:top w:val="nil"/>
+              <w:left w:val="single" w:sz="8" w:space="0" w:color="auto"/>
+              <w:bottom w:val="single" w:sz="8" w:space="0" w:color="auto"/>
+              <w:right w:val="single" w:sz="8" w:space="0" w:color="auto"/>
+            </w:tcBorders>
+            <w:shd w:val="clear" w:color="auto" w:fill="auto"/>
+            <w:noWrap/>
+            <w:vAlign w:val="center"/>
+          </w:tcPr>
+          <w:p>
+            <w:pPr>
+              <w:spacing w:after="0" w:line="240" w:lineRule="auto"/>
+              <w:rPr>
+                <w:rFonts w:ascii="Calibri" w:eastAsia="Times New Roman" w:hAnsi="Calibri" w:cs="Calibri"/>
+                <w:color w:val="000000"/>
+                <w:kern w:val="0"/>
+                <w14:ligatures w14:val="none"/>
+              </w:rPr>
+            </w:pPr>
+            <w:r>
+              <w:rPr>
+                <w:rFonts w:ascii="Calibri" w:eastAsia="Times New Roman" w:hAnsi="Calibri" w:cs="Calibri"/>
+                <w:color w:val="000000"/>
+                <w:kern w:val="0"/>
+                <w14:ligatures w14:val="none"/>
+              </w:rPr>
+              <w:t>STILL</w:t>
+            </w:r>
+          </w:p>
+        </w:tc>
+        <w:tc>
+          <w:tcPr>
+            <w:tcW w:w="5850" w:type="dxa"/>
+            <w:tcBorders>
+              <w:top w:val="nil"/>
+              <w:left w:val="nil"/>
+              <w:bottom w:val="single" w:sz="8" w:space="0" w:color="auto"/>
+              <w:right w:val="single" w:sz="8" w:space="0" w:color="auto"/>
+            </w:tcBorders>
+            <w:shd w:val="clear" w:color="auto" w:fill="auto"/>
+            <w:vAlign w:val="center"/>
+          </w:tcPr>
+          <w:p>
+            <w:pPr>
+              <w:spacing w:after="0" w:line="240" w:lineRule="auto"/>
+              <w:rPr>
+                <w:rFonts w:ascii="Calibri" w:eastAsia="Times New Roman" w:hAnsi="Calibri" w:cs="Calibri"/>
+                <w:color w:val="000000"/>
+                <w:kern w:val="0"/>
+                <w14:ligatures w14:val="none"/>
+              </w:rPr>
+            </w:pPr>
+            <w:r>
+              <w:rPr>
+                <w:rFonts w:ascii="Calibri" w:eastAsia="Times New Roman" w:hAnsi="Calibri" w:cs="Calibri"/>
+                <w:color w:val="000000"/>
+                <w:kern w:val="0"/>
+                <w14:ligatures w14:val="none"/>
+              </w:rPr>
+              <w:t>@o| y2 y6/=@o</w:t>
+            </w:r>
+          </w:p>
+        </w:tc>
+      </w:tr>
+      <w:tr>
+        <w:trPr>
+          <w:trHeight w:val="300"/>
+        </w:trPr>
+        <w:tc>
+          <w:tcPr>
+            <w:tcW w:w="2600" w:type="dxa"/>
+            <w:tcBorders>
+              <w:top w:val="nil"/>
+              <w:left w:val="single" w:sz="8" w:space="0" w:color="auto"/>
+              <w:bottom w:val="single" w:sz="8" w:space="0" w:color="auto"/>
+              <w:right w:val="single" w:sz="8" w:space="0" w:color="auto"/>
+            </w:tcBorders>
+            <w:shd w:val="clear" w:color="auto" w:fill="auto"/>
+            <w:noWrap/>
+            <w:vAlign w:val="center"/>
+          </w:tcPr>
+          <w:p>
+            <w:pPr>
+              <w:spacing w:after="0" w:line="240" w:lineRule="auto"/>
+              <w:rPr>
+                <w:rFonts w:ascii="Calibri" w:eastAsia="Times New Roman" w:hAnsi="Calibri" w:cs="Calibri"/>
+                <w:color w:val="000000"/>
+                <w:kern w:val="0"/>
+                <w14:ligatures w14:val="none"/>
+              </w:rPr>
+            </w:pPr>
+            <w:r>
+              <w:rPr>
+                <w:rFonts w:ascii="Calibri" w:eastAsia="Times New Roman" w:hAnsi="Calibri" w:cs="Calibri"/>
+                <w:color w:val="000000"/>
+                <w:kern w:val="0"/>
+                <w14:ligatures w14:val="none"/>
+              </w:rPr>
+              <w:t>STORY</w:t>
+            </w:r>
+          </w:p>
+        </w:tc>
+        <w:tc>
+          <w:tcPr>
+            <w:tcW w:w="5850" w:type="dxa"/>
+            <w:tcBorders>
+              <w:top w:val="nil"/>
+              <w:left w:val="nil"/>
+              <w:bottom w:val="single" w:sz="8" w:space="0" w:color="auto"/>
+              <w:right w:val="single" w:sz="8" w:space="0" w:color="auto"/>
+            </w:tcBorders>
+            <w:shd w:val="clear" w:color="auto" w:fill="auto"/>
+            <w:vAlign w:val="center"/>
+          </w:tcPr>
+          <w:p>
+            <w:pPr>
+              <w:spacing w:after="0" w:line="240" w:lineRule="auto"/>
+              <w:rPr>
+                <w:rFonts w:ascii="Calibri" w:eastAsia="Times New Roman" w:hAnsi="Calibri" w:cs="Calibri"/>
+                <w:color w:val="000000"/>
+                <w:kern w:val="0"/>
+                <w14:ligatures w14:val="none"/>
+              </w:rPr>
+            </w:pPr>
+            <w:r>
+              <w:rPr>
+                <w:rFonts w:ascii="Calibri" w:eastAsia="Times New Roman" w:hAnsi="Calibri" w:cs="Calibri"/>
+                <w:color w:val="000000"/>
+                <w:kern w:val="0"/>
+                <w14:ligatures w14:val="none"/>
+              </w:rPr>
+              <w:t>o</w:t>
+            </w:r>
+            <w:r>
+              <w:rPr>
+                <w:rFonts w:ascii="Calibri" w:eastAsia="Times New Roman" w:hAnsi="Calibri" w:cs="Calibri"/>
+                <w:color w:val="000000"/>
+                <w:kern w:val="0"/>
+                <w14:ligatures w14:val="none"/>
+              </w:rPr>
+              <w:t>/</w:t>
+            </w:r>
+            <w:proofErr w:type="gramStart"/>
+            <w:r>
+              <w:rPr>
+                <w:rFonts w:ascii="Calibri" w:eastAsia="Times New Roman" w:hAnsi="Calibri" w:cs="Calibri"/>
+                <w:color w:val="000000"/>
+                <w:kern w:val="0"/>
+                <w14:ligatures w14:val="none"/>
+              </w:rPr>
+              <w:t>-!:</w:t>
+            </w:r>
+            <w:proofErr w:type="gramEnd"/>
+            <w:r>
+              <w:rPr>
+                <w:rFonts w:ascii="Calibri" w:eastAsia="Times New Roman" w:hAnsi="Calibri" w:cs="Calibri"/>
+                <w:color w:val="000000"/>
+                <w:kern w:val="0"/>
+                <w14:ligatures w14:val="none"/>
+              </w:rPr>
+              <w:t>6,-52/ 56-!:2,-</w:t>
+            </w:r>
+            <w:r>
+              <w:rPr>
+                <w:rFonts w:ascii="Calibri" w:eastAsia="Times New Roman" w:hAnsi="Calibri" w:cs="Calibri"/>
+                <w:color w:val="000000"/>
+                <w:kern w:val="0"/>
+                <w14:ligatures w14:val="none"/>
+              </w:rPr>
+              <w:t>o</w:t>
+            </w:r>
+          </w:p>
+        </w:tc>
+      </w:tr>
+      <w:tr>
+        <w:trPr>
+          <w:trHeight w:val="300"/>
+        </w:trPr>
+        <w:tc>
+          <w:tcPr>
+            <w:tcW w:w="2600" w:type="dxa"/>
+            <w:tcBorders>
+              <w:top w:val="nil"/>
+              <w:left w:val="single" w:sz="8" w:space="0" w:color="auto"/>
+              <w:bottom w:val="single" w:sz="8" w:space="0" w:color="auto"/>
+              <w:right w:val="single" w:sz="8" w:space="0" w:color="auto"/>
+            </w:tcBorders>
+            <w:shd w:val="clear" w:color="auto" w:fill="auto"/>
+            <w:noWrap/>
+            <w:vAlign w:val="center"/>
+          </w:tcPr>
+          <w:p>
+            <w:pPr>
+              <w:spacing w:after="0" w:line="240" w:lineRule="auto"/>
+              <w:rPr>
+                <w:rFonts w:ascii="Calibri" w:eastAsia="Times New Roman" w:hAnsi="Calibri" w:cs="Calibri"/>
+                <w:color w:val="000000"/>
+                <w:kern w:val="0"/>
+                <w14:ligatures w14:val="none"/>
+              </w:rPr>
+            </w:pPr>
+            <w:r>
+              <w:rPr>
+                <w:rFonts w:ascii="Calibri" w:eastAsia="Times New Roman" w:hAnsi="Calibri" w:cs="Calibri"/>
+                <w:color w:val="000000"/>
+                <w:kern w:val="0"/>
+                <w14:ligatures w14:val="none"/>
+              </w:rPr>
+              <w:lastRenderedPageBreak/>
+              <w:t>STUDY</w:t>
+            </w:r>
+          </w:p>
+        </w:tc>
+        <w:tc>
+          <w:tcPr>
+            <w:tcW w:w="5850" w:type="dxa"/>
+            <w:tcBorders>
+              <w:top w:val="nil"/>
+              <w:left w:val="nil"/>
+              <w:bottom w:val="single" w:sz="8" w:space="0" w:color="auto"/>
+              <w:right w:val="single" w:sz="8" w:space="0" w:color="auto"/>
+            </w:tcBorders>
+            <w:shd w:val="clear" w:color="auto" w:fill="auto"/>
+            <w:vAlign w:val="center"/>
+          </w:tcPr>
+          <w:p>
+            <w:pPr>
+              <w:spacing w:after="0" w:line="240" w:lineRule="auto"/>
+              <w:rPr>
+                <w:rFonts w:ascii="Calibri" w:eastAsia="Times New Roman" w:hAnsi="Calibri" w:cs="Calibri"/>
+                <w:color w:val="000000"/>
+                <w:kern w:val="0"/>
+                <w14:ligatures w14:val="none"/>
+              </w:rPr>
+            </w:pPr>
+            <w:r>
+              <w:rPr>
+                <w:rFonts w:ascii="Calibri" w:eastAsia="Times New Roman" w:hAnsi="Calibri" w:cs="Calibri"/>
+                <w:color w:val="000000"/>
+                <w:kern w:val="0"/>
+                <w14:ligatures w14:val="none"/>
+              </w:rPr>
+              <w:t>B2=@w</w:t>
+            </w:r>
+            <w:proofErr w:type="gramStart"/>
+            <w:r>
+              <w:rPr>
+                <w:rFonts w:ascii="Calibri" w:eastAsia="Times New Roman" w:hAnsi="Calibri" w:cs="Calibri"/>
+                <w:color w:val="000000"/>
+                <w:kern w:val="0"/>
+                <w14:ligatures w14:val="none"/>
+              </w:rPr>
+              <w:t>5;-</w:t>
+            </w:r>
+            <w:proofErr w:type="gramEnd"/>
+            <w:r>
+              <w:rPr>
+                <w:rFonts w:ascii="Calibri" w:eastAsia="Times New Roman" w:hAnsi="Calibri" w:cs="Calibri"/>
+                <w:color w:val="000000"/>
+                <w:kern w:val="0"/>
+                <w14:ligatures w14:val="none"/>
+              </w:rPr>
+              <w:t>55/'</w:t>
+            </w:r>
+          </w:p>
+        </w:tc>
+      </w:tr>
+      <w:tr>
+        <w:trPr>
+          <w:trHeight w:val="300"/>
+        </w:trPr>
+        <w:tc>
+          <w:tcPr>
+            <w:tcW w:w="2600" w:type="dxa"/>
+            <w:tcBorders>
+              <w:top w:val="nil"/>
+              <w:left w:val="single" w:sz="8" w:space="0" w:color="auto"/>
+              <w:bottom w:val="single" w:sz="8" w:space="0" w:color="auto"/>
+              <w:right w:val="single" w:sz="8" w:space="0" w:color="auto"/>
+            </w:tcBorders>
+            <w:shd w:val="clear" w:color="auto" w:fill="auto"/>
+            <w:noWrap/>
+            <w:vAlign w:val="center"/>
+          </w:tcPr>
+          <w:p>
+            <w:pPr>
+              <w:spacing w:after="0" w:line="240" w:lineRule="auto"/>
+              <w:rPr>
+                <w:rFonts w:ascii="Calibri" w:eastAsia="Times New Roman" w:hAnsi="Calibri" w:cs="Calibri"/>
+                <w:color w:val="000000"/>
+                <w:kern w:val="0"/>
+                <w14:ligatures w14:val="none"/>
+              </w:rPr>
+            </w:pPr>
+            <w:r>
+              <w:rPr>
+                <w:rFonts w:ascii="Calibri" w:eastAsia="Times New Roman" w:hAnsi="Calibri" w:cs="Calibri"/>
+                <w:color w:val="000000"/>
+                <w:kern w:val="0"/>
+                <w14:ligatures w14:val="none"/>
+              </w:rPr>
+              <w:t>SUPPORT</w:t>
+            </w:r>
+          </w:p>
+        </w:tc>
+        <w:tc>
+          <w:tcPr>
+            <w:tcW w:w="5850" w:type="dxa"/>
+            <w:tcBorders>
+              <w:top w:val="nil"/>
+              <w:left w:val="nil"/>
+              <w:bottom w:val="single" w:sz="8" w:space="0" w:color="auto"/>
+              <w:right w:val="single" w:sz="8" w:space="0" w:color="auto"/>
+            </w:tcBorders>
+            <w:shd w:val="clear" w:color="auto" w:fill="auto"/>
+            <w:vAlign w:val="center"/>
+          </w:tcPr>
+          <w:p>
+            <w:pPr>
+              <w:spacing w:after="0" w:line="240" w:lineRule="auto"/>
+              <w:rPr>
+                <w:rFonts w:ascii="Calibri" w:eastAsia="Times New Roman" w:hAnsi="Calibri" w:cs="Calibri"/>
+                <w:color w:val="000000"/>
+                <w:kern w:val="0"/>
+                <w14:ligatures w14:val="none"/>
+              </w:rPr>
+            </w:pPr>
+            <w:r>
+              <w:rPr>
+                <w:rFonts w:ascii="Calibri" w:eastAsia="Times New Roman" w:hAnsi="Calibri" w:cs="Calibri"/>
+                <w:color w:val="000000"/>
+                <w:kern w:val="0"/>
+                <w14:ligatures w14:val="none"/>
+              </w:rPr>
+              <w:t>s'</w:t>
+            </w:r>
+            <w:proofErr w:type="gramStart"/>
+            <w:r>
+              <w:rPr>
+                <w:rFonts w:ascii="Calibri" w:eastAsia="Times New Roman" w:hAnsi="Calibri" w:cs="Calibri"/>
+                <w:color w:val="000000"/>
+                <w:kern w:val="0"/>
+                <w14:ligatures w14:val="none"/>
+              </w:rPr>
+              <w:t>=!t</w:t>
+            </w:r>
+            <w:proofErr w:type="gramEnd"/>
+            <w:r>
+              <w:rPr>
+                <w:rFonts w:ascii="Calibri" w:eastAsia="Times New Roman" w:hAnsi="Calibri" w:cs="Calibri"/>
+                <w:color w:val="000000"/>
+                <w:kern w:val="0"/>
+                <w14:ligatures w14:val="none"/>
+              </w:rPr>
+              <w:t>7=s/</w:t>
+            </w:r>
+          </w:p>
+        </w:tc>
+      </w:tr>
+      <w:tr>
+        <w:trPr>
+          <w:trHeight w:val="300"/>
+        </w:trPr>
+        <w:tc>
+          <w:tcPr>
+            <w:tcW w:w="2600" w:type="dxa"/>
+            <w:tcBorders>
+              <w:top w:val="nil"/>
+              <w:left w:val="single" w:sz="8" w:space="0" w:color="auto"/>
+              <w:bottom w:val="single" w:sz="8" w:space="0" w:color="auto"/>
+              <w:right w:val="single" w:sz="8" w:space="0" w:color="auto"/>
+            </w:tcBorders>
+            <w:shd w:val="clear" w:color="auto" w:fill="auto"/>
+            <w:noWrap/>
+            <w:vAlign w:val="center"/>
+          </w:tcPr>
+          <w:p>
+            <w:pPr>
+              <w:spacing w:after="0" w:line="240" w:lineRule="auto"/>
+              <w:rPr>
+                <w:rFonts w:ascii="Calibri" w:eastAsia="Times New Roman" w:hAnsi="Calibri" w:cs="Calibri"/>
+                <w:color w:val="000000"/>
+                <w:kern w:val="0"/>
+                <w14:ligatures w14:val="none"/>
+              </w:rPr>
+            </w:pPr>
+            <w:r>
+              <w:rPr>
+                <w:rFonts w:ascii="Calibri" w:eastAsia="Times New Roman" w:hAnsi="Calibri" w:cs="Calibri"/>
+                <w:color w:val="000000"/>
+                <w:kern w:val="0"/>
+                <w14:ligatures w14:val="none"/>
+              </w:rPr>
+              <w:t>THANK-YOU</w:t>
+            </w:r>
+          </w:p>
+        </w:tc>
+        <w:tc>
+          <w:tcPr>
+            <w:tcW w:w="5850" w:type="dxa"/>
+            <w:tcBorders>
+              <w:top w:val="nil"/>
+              <w:left w:val="nil"/>
+              <w:bottom w:val="single" w:sz="8" w:space="0" w:color="auto"/>
+              <w:right w:val="single" w:sz="8" w:space="0" w:color="auto"/>
+            </w:tcBorders>
+            <w:shd w:val="clear" w:color="auto" w:fill="auto"/>
+            <w:vAlign w:val="center"/>
+          </w:tcPr>
+          <w:p>
+            <w:pPr>
+              <w:spacing w:after="0" w:line="240" w:lineRule="auto"/>
+              <w:rPr>
+                <w:rFonts w:ascii="Calibri" w:eastAsia="Times New Roman" w:hAnsi="Calibri" w:cs="Calibri"/>
+                <w:color w:val="000000"/>
+                <w:kern w:val="0"/>
+                <w14:ligatures w14:val="none"/>
+              </w:rPr>
+            </w:pPr>
+            <w:proofErr w:type="gramStart"/>
+            <w:r>
+              <w:rPr>
+                <w:rFonts w:ascii="Calibri" w:eastAsia="Times New Roman" w:hAnsi="Calibri" w:cs="Calibri"/>
+                <w:color w:val="000000"/>
+                <w:kern w:val="0"/>
+                <w14:ligatures w14:val="none"/>
+              </w:rPr>
+              <w:t>}~</w:t>
+            </w:r>
+            <w:proofErr w:type="gramEnd"/>
+            <w:r>
+              <w:rPr>
+                <w:rFonts w:ascii="Calibri" w:eastAsia="Times New Roman" w:hAnsi="Calibri" w:cs="Calibri"/>
+                <w:color w:val="000000"/>
+                <w:kern w:val="0"/>
+                <w14:ligatures w14:val="none"/>
+              </w:rPr>
               <w:t>'4/|B/1.- !3,</w:t>
+            </w:r>
+            <w:r>
+              <w:rPr>
+                <w:rFonts w:ascii="Calibri" w:eastAsia="Times New Roman" w:hAnsi="Calibri" w:cs="Calibri"/>
+                <w:color w:val="000000"/>
+                <w:kern w:val="0"/>
+                <w14:ligatures w14:val="none"/>
+              </w:rPr>
+              <w:t xml:space="preserve">  OR  </w:t>
+            </w:r>
+            <w:r>
+              <w:rPr>
+                <w:rFonts w:ascii="Calibri" w:eastAsia="Times New Roman" w:hAnsi="Calibri" w:cs="Calibri"/>
+                <w:color w:val="000000"/>
+                <w:kern w:val="0"/>
+                <w14:ligatures w14:val="none"/>
+              </w:rPr>
+              <w:t>}~'4/|C1.|!3,</w:t>
             </w:r>
           </w:p>
         </w:tc>
@@ -17795,7 +19685,7 @@
         <v:path o:extrusionok="f" gradientshapeok="t" o:connecttype="rect"/>
         <o:lock v:ext="edit" aspectratio="t"/>
       </v:shapetype>
-      <v:shape id="_x0000_i1084" type="#_x0000_t75" style="width:12pt;height:14.1pt;visibility:visible;mso-wrap-style:square" o:bullet="t">
+      <v:shape id="_x0000_i1055" type="#_x0000_t75" style="width:12pt;height:14.1pt;visibility:visible;mso-wrap-style:square" o:bullet="t">
         <v:imagedata r:id="rId1" o:title=""/>
       </v:shape>
     </w:pict>
@@ -18895,7 +20785,6 @@
   <w:style w:type="character" w:default="1" w:styleId="DefaultParagraphFont">
     <w:name w:val="Default Paragraph Font"/>
     <w:uiPriority w:val="1"/>
-    <w:semiHidden/>
     <w:unhideWhenUsed/>
   </w:style>
   <w:style w:type="table" w:default="1" w:styleId="TableNormal">

</xml_diff>